<commit_message>
Study 6: GPT-5-nano and Qwen3-14B reported as excluded (invalid, not repeated); fix count of other valid small models
Co-Authored-By: Claude Sonnet 5.5 <noreply@anthropic.com>
Claude-Session: https://claude.ai/code/session_013HycsBHnRQDCEHKmLM3Rd4
</commit_message>
<xml_diff>
--- a/loss_chasing/isr/ISR_manuscript_v4.docx
+++ b/loss_chasing/isr/ISR_manuscript_v4.docx
@@ -14690,7 +14690,7 @@
                 <w:sz w:val="20"/>
                 <w:szCs w:val="20"/>
               </w:rPr>
-              <w:t xml:space="preserve">Invalid run</w:t>
+              <w:t xml:space="preserve">Excluded (invalid run)</w:t>
             </w:r>
           </w:p>
         </w:tc>
@@ -14896,7 +14896,7 @@
                 <w:sz w:val="20"/>
                 <w:szCs w:val="20"/>
               </w:rPr>
-              <w:t xml:space="preserve">Invalid run</w:t>
+              <w:t xml:space="preserve">Excluded (invalid run)</w:t>
             </w:r>
           </w:p>
         </w:tc>
@@ -14937,7 +14937,7 @@
           <w:sz w:val="24"/>
           <w:szCs w:val="24"/>
         </w:rPr>
-        <w:t xml:space="preserve">Of the seven models, one passed the screen. Gemini 2.5 Flash-Lite skipped in 17.2% of first choices at three turns left, with the same ordering of frames as Haiku 4.5 (gain 30.6%, neutral 16.7%, loss 4.4%). Its loss frame skipped less than its gain-to-goal frame (-26.2 points, 95% interval -41.5 to -12.9 over wordings; below in 11 of 16 wordings and above in 1), and its neutral frame skipped less than its gain frame (-14.0 [-27.1, -1.7]). Ministral-8B did not meet the 5% rule (4.0%), but its ordering was the same (loss 0.6%, neutral 0.0%, gain 11.5%; loss minus gain -10.8 [-24.0, -1.7]); we report it as below the screen and did not extend it. Llama-3.1-8B (2.4%) showed no frame difference (+0.4 [-1.0, +1.9]), and Gemini 3.1 Flash-Lite and Gemma-3-12B did not skip in any cell, so the question is not informative for them. The first runs of GPT-5-nano and Qwen3-14B, which reason by default, returned empty answers in 1,440 and 1,276 first choices because the output budget of 200 tokens was used by hidden reasoning; these runs are invalid and are not interpreted as floors. For the models with valid runs there were at most three parse failures and no refusals in 1,440 first choices.</w:t>
+        <w:t xml:space="preserve">Of the seven models, one passed the screen. Gemini 2.5 Flash-Lite skipped in 17.2% of first choices at three turns left, with the same ordering of frames as Haiku 4.5 (gain 30.6%, neutral 16.7%, loss 4.4%). Its loss frame skipped less than its gain-to-goal frame (-26.2 points, 95% interval -41.5 to -12.9 over wordings; below in 11 of 16 wordings and above in 1), and its neutral frame skipped less than its gain frame (-14.0 [-27.1, -1.7]). Ministral-8B did not meet the 5% rule (4.0%), but its ordering was the same (loss 0.6%, neutral 0.0%, gain 11.5%; loss minus gain -10.8 [-24.0, -1.7]); we report it as below the screen and did not extend it. Llama-3.1-8B (2.4%) showed no frame difference (+0.4 [-1.0, +1.9]), and Gemini 3.1 Flash-Lite and Gemma-3-12B did not skip in any cell, so the question is not informative for them. The first runs of GPT-5-nano and Qwen3-14B, which reason by default, returned empty answers in 1,440 and 1,276 first choices because the output budget of 200 tokens was used by hidden reasoning; these runs are invalid and are not interpreted as floors; we did not repeat them, and the two models are excluded from the comparison. For the models with valid runs there were at most three parse failures and no refusals in 1,440 first choices.</w:t>
       </w:r>
     </w:p>
     <w:p>
@@ -17456,7 +17456,7 @@
           <w:sz w:val="24"/>
           <w:szCs w:val="24"/>
         </w:rPr>
-        <w:t xml:space="preserve">The registered question is whether an LLM maintenance operator chases losses because of accounting frames. We find no evidence of it in the three models of Study 1, in the four commercial tiers of Study 2, or in the fast tier with thinking or with the target manipulated in Studies 3 and 4 (P4). Where skipping occurs, it is associated with time pressure (P3) and with a visible target (P1), reasoning removes most of it (P2), stating the expected quality change of each option lowers it without removing it (P5), and larger commercial tiers that reason by default did not skip at all (P6). A small model from a second vendor (Gemini 2.5 Flash-Lite) showed the same ordering of frames, the effect of time pressure, and an effect of target visibility, while four of the other five valid small models skipped little or not at all (Study 6). The finding is not that framing is irrelevant: the headline sentence moved the fast tier's skipping from 0% to 100% across conditions. It is that the ingredient that mattered appears to be what the sentence tells the operator about the goal, and not whether it describes a loss.</w:t>
+        <w:t xml:space="preserve">The registered question is whether an LLM maintenance operator chases losses because of accounting frames. We find no evidence of it in the three models of Study 1, in the four commercial tiers of Study 2, or in the fast tier with thinking or with the target manipulated in Studies 3 and 4 (P4). Where skipping occurs, it is associated with time pressure (P3) and with a visible target (P1), reasoning removes most of it (P2), stating the expected quality change of each option lowers it without removing it (P5), and larger commercial tiers that reason by default did not skip at all (P6). A small model from a second vendor (Gemini 2.5 Flash-Lite) showed the same ordering of frames, the effect of time pressure, and an effect of target visibility, while the other four valid small models skipped little or not at all (Study 6). The finding is not that framing is irrelevant: the headline sentence moved the fast tier's skipping from 0% to 100% across conditions. It is that the ingredient that mattered appears to be what the sentence tells the operator about the goal, and not whether it describes a loss.</w:t>
       </w:r>
     </w:p>
     <w:p>

</xml_diff>

<commit_message>
Shorten main text: move Study 6 detail to Online Appendix F, tighten 2.2 and limitations
Co-Authored-By: Claude Sonnet 5.5 <noreply@anthropic.com>
Claude-Session: https://claude.ai/code/session_013HycsBHnRQDCEHKmLM3Rd4
</commit_message>
<xml_diff>
--- a/loss_chasing/isr/ISR_manuscript_v4.docx
+++ b/loss_chasing/isr/ISR_manuscript_v4.docx
@@ -383,7 +383,7 @@
           <w:sz w:val="24"/>
           <w:szCs w:val="24"/>
         </w:rPr>
-        <w:t xml:space="preserve"> nor faithful replicas of human participants; they report weaker loss aversion than in human samples, steeper time discounting, and inconsistency when the framing of a task changes. Bini et al. (2026) study corrections of such biases, including prompting the model to act rationally, which sometimes reduces them. Du (2025) documents gambling-like risk taking in generation tasks. Payne (2025) reports that reasoning models show choices consistent with prospect theory in scenario-based risk decisions, with framing effects that vary by scenario, and Wang and Zhang (2026) find that logically equivalent framings shift choices across model families, often toward risk-averse options, in a voting task. These studies mostly examine one-shot allocation or risk choices. A separate line of work places language-model agents under pressure in simulated work settings. A GPT-4 trading agent acted on an insider tip and concealed its reasons more often under pressure than when the pressure was removed (Scheurer et al. 2023). Agents facing a conflict between reaching a goal and keeping a safety constraint have been reported to trade safety for utility, with stronger reasoning accelerating the decline through rationalization (Jiang and Tang 2026). Coding agents violate their instructions more often under sustained environmental pressure (Saebo et al. 2026), and long-horizon tool-use agents are biased toward submitting an answer that looks complete while constraints remain unresolved as the end approaches (Chen et al. 2026). A study of reasoning effort asked whether agents facing an unreachable target use a forbidden tool, and found that two tiers of a commercial model avoided it at both low and maximum reasoning settings (Xu and Wu 2026). Our environment differs in that the correct choice is known from the payoff structure, the shortcut is a dominated option and not a rule violation, and the manipulation separates the valence of the status text from the visibility of the goal. Training that aligns models to follow instructions (Ouyang et al. 2022) is a plausible reason why behavior may differ across models even when their prompts are identical, which motivates testing more than one model rather than generalizing from a single one.</w:t>
+        <w:t xml:space="preserve"> nor faithful replicas of human participants, with weaker loss aversion than in human samples, steeper time discounting, and inconsistency when the framing of a task changes. Bini et al. (2026) study corrections of such biases, and Du (2025) documents gambling-like risk taking in generation tasks. Payne (2025) reports choices consistent with prospect theory in reasoning models, with framing effects that vary by scenario, and Wang and Zhang (2026) find that logically equivalent framings shift choices across model families. These studies mostly examine one-shot allocation or risk choices. A separate line of work places agents under pressure in simulated work settings: a GPT-4 trading agent acted on an insider tip and concealed its reasons more often under pressure (Scheurer et al. 2023), agents have been reported to trade safety for utility, with stronger reasoning accelerating the decline (Jiang and Tang 2026), coding agents violate their instructions more often under sustained pressure (Saebo et al. 2026), and long-horizon agents are biased toward submitting an answer that looks complete as the end approaches (Chen et al. 2026). A study of reasoning effort found that two tiers of a commercial model avoided a forbidden tool at both low and maximum settings (Xu and Wu 2026). Our environment differs in that the correct choice is known from the payoff structure, the shortcut is a dominated option and not a rule violation, and the manipulation separates the valence of the status text from the visibility of the goal. Because alignment training (Ouyang et al. 2022) may make behavior differ across models even with identical prompts, we test more than one model.</w:t>
       </w:r>
     </w:p>
     <w:p>
@@ -14952,879 +14952,7 @@
           <w:sz w:val="24"/>
           <w:szCs w:val="24"/>
         </w:rPr>
-        <w:t xml:space="preserve">Skipping by Gemini 2.5 Flash-Lite appeared under time pressure only: 0.3% at twelve turns left, 1.5% at six, and 17.2% at three (Table 11).</w:t>
-      </w:r>
-    </w:p>
-    <w:p>
-      <w:pPr>
-        <w:keepNext/>
-        <w:spacing w:after="0" w:before="0" w:line="480"/>
-      </w:pPr>
-      <w:r>
-        <w:rPr>
-          <w:rFonts w:ascii="Times New Roman" w:cs="Times New Roman" w:eastAsia="Times New Roman" w:hAnsi="Times New Roman"/>
-          <w:b/>
-          <w:bCs/>
-          <w:sz w:val="24"/>
-          <w:szCs w:val="24"/>
-        </w:rPr>
-        <w:t xml:space="preserve">Table 11.</w:t>
-      </w:r>
-      <w:r>
-        <w:rPr>
-          <w:rFonts w:ascii="Times New Roman" w:cs="Times New Roman" w:eastAsia="Times New Roman" w:hAnsi="Times New Roman"/>
-          <w:sz w:val="24"/>
-          <w:szCs w:val="24"/>
-        </w:rPr>
-        <w:t xml:space="preserve"> Study 6: Gemini 2.5 Flash-Lite by turns left (16 wordings x 30 episodes per cell).</w:t>
-      </w:r>
-    </w:p>
-    <w:tbl>
-      <w:tblPr>
-        <w:tblW w:type="dxa" w:w="9360"/>
-        <w:tblBorders>
-          <w:top w:val="single" w:color="auto" w:sz="4"/>
-          <w:left w:val="single" w:color="auto" w:sz="4"/>
-          <w:bottom w:val="single" w:color="auto" w:sz="4"/>
-          <w:right w:val="single" w:color="auto" w:sz="4"/>
-          <w:insideH w:val="single" w:color="auto" w:sz="4"/>
-          <w:insideV w:val="single" w:color="auto" w:sz="4"/>
-        </w:tblBorders>
-      </w:tblPr>
-      <w:tblGrid>
-        <w:gridCol w:w="900"/>
-        <w:gridCol w:w="1700"/>
-        <w:gridCol w:w="1700"/>
-        <w:gridCol w:w="1700"/>
-        <w:gridCol w:w="1300"/>
-        <w:gridCol w:w="2060"/>
-      </w:tblGrid>
-      <w:tr>
-        <w:trPr>
-          <w:cantSplit/>
-          <w:tblHeader/>
-        </w:trPr>
-        <w:tc>
-          <w:tcPr>
-            <w:tcW w:type="dxa" w:w="900"/>
-            <w:tcBorders>
-              <w:top w:val="single" w:color="000000" w:sz="4"/>
-              <w:left w:val="none" w:color="FFFFFF" w:sz="0"/>
-              <w:bottom w:val="single" w:color="000000" w:sz="4"/>
-              <w:right w:val="none" w:color="FFFFFF" w:sz="0"/>
-            </w:tcBorders>
-            <w:shd w:fill="FFFFFF" w:color="auto" w:val="clear"/>
-            <w:tcMar>
-              <w:top w:type="dxa" w:w="40"/>
-              <w:left w:type="dxa" w:w="80"/>
-              <w:bottom w:type="dxa" w:w="40"/>
-              <w:right w:type="dxa" w:w="80"/>
-            </w:tcMar>
-          </w:tcPr>
-          <w:p>
-            <w:pPr>
-              <w:spacing w:after="0" w:before="0" w:line="240"/>
-              <w:jc w:val="left"/>
-            </w:pPr>
-            <w:r>
-              <w:rPr>
-                <w:rFonts w:ascii="Times New Roman" w:cs="Times New Roman" w:eastAsia="Times New Roman" w:hAnsi="Times New Roman"/>
-                <w:b/>
-                <w:bCs/>
-                <w:sz w:val="20"/>
-                <w:szCs w:val="20"/>
-              </w:rPr>
-              <w:t xml:space="preserve">Turns left</w:t>
-            </w:r>
-          </w:p>
-        </w:tc>
-        <w:tc>
-          <w:tcPr>
-            <w:tcW w:type="dxa" w:w="1700"/>
-            <w:tcBorders>
-              <w:top w:val="single" w:color="000000" w:sz="4"/>
-              <w:left w:val="none" w:color="FFFFFF" w:sz="0"/>
-              <w:bottom w:val="single" w:color="000000" w:sz="4"/>
-              <w:right w:val="none" w:color="FFFFFF" w:sz="0"/>
-            </w:tcBorders>
-            <w:shd w:fill="FFFFFF" w:color="auto" w:val="clear"/>
-            <w:tcMar>
-              <w:top w:type="dxa" w:w="40"/>
-              <w:left w:type="dxa" w:w="80"/>
-              <w:bottom w:type="dxa" w:w="40"/>
-              <w:right w:type="dxa" w:w="80"/>
-            </w:tcMar>
-          </w:tcPr>
-          <w:p>
-            <w:pPr>
-              <w:spacing w:after="0" w:before="0" w:line="240"/>
-              <w:jc w:val="center"/>
-            </w:pPr>
-            <w:r>
-              <w:rPr>
-                <w:rFonts w:ascii="Times New Roman" w:cs="Times New Roman" w:eastAsia="Times New Roman" w:hAnsi="Times New Roman"/>
-                <w:b/>
-                <w:bCs/>
-                <w:sz w:val="20"/>
-                <w:szCs w:val="20"/>
-              </w:rPr>
-              <w:t xml:space="preserve">Skip rate (range over cells)</w:t>
-            </w:r>
-          </w:p>
-        </w:tc>
-        <w:tc>
-          <w:tcPr>
-            <w:tcW w:type="dxa" w:w="1700"/>
-            <w:tcBorders>
-              <w:top w:val="single" w:color="000000" w:sz="4"/>
-              <w:left w:val="none" w:color="FFFFFF" w:sz="0"/>
-              <w:bottom w:val="single" w:color="000000" w:sz="4"/>
-              <w:right w:val="none" w:color="FFFFFF" w:sz="0"/>
-            </w:tcBorders>
-            <w:shd w:fill="FFFFFF" w:color="auto" w:val="clear"/>
-            <w:tcMar>
-              <w:top w:type="dxa" w:w="40"/>
-              <w:left w:type="dxa" w:w="80"/>
-              <w:bottom w:type="dxa" w:w="40"/>
-              <w:right w:type="dxa" w:w="80"/>
-            </w:tcMar>
-          </w:tcPr>
-          <w:p>
-            <w:pPr>
-              <w:spacing w:after="0" w:before="0" w:line="240"/>
-              <w:jc w:val="center"/>
-            </w:pPr>
-            <w:r>
-              <w:rPr>
-                <w:rFonts w:ascii="Times New Roman" w:cs="Times New Roman" w:eastAsia="Times New Roman" w:hAnsi="Times New Roman"/>
-                <w:b/>
-                <w:bCs/>
-                <w:sz w:val="20"/>
-                <w:szCs w:val="20"/>
-              </w:rPr>
-              <w:t xml:space="preserve">Loss minus gain, pp [95% CI]</w:t>
-            </w:r>
-          </w:p>
-        </w:tc>
-        <w:tc>
-          <w:tcPr>
-            <w:tcW w:type="dxa" w:w="1700"/>
-            <w:tcBorders>
-              <w:top w:val="single" w:color="000000" w:sz="4"/>
-              <w:left w:val="none" w:color="FFFFFF" w:sz="0"/>
-              <w:bottom w:val="single" w:color="000000" w:sz="4"/>
-              <w:right w:val="none" w:color="FFFFFF" w:sz="0"/>
-            </w:tcBorders>
-            <w:shd w:fill="FFFFFF" w:color="auto" w:val="clear"/>
-            <w:tcMar>
-              <w:top w:type="dxa" w:w="40"/>
-              <w:left w:type="dxa" w:w="80"/>
-              <w:bottom w:type="dxa" w:w="40"/>
-              <w:right w:type="dxa" w:w="80"/>
-            </w:tcMar>
-          </w:tcPr>
-          <w:p>
-            <w:pPr>
-              <w:spacing w:after="0" w:before="0" w:line="240"/>
-              <w:jc w:val="center"/>
-            </w:pPr>
-            <w:r>
-              <w:rPr>
-                <w:rFonts w:ascii="Times New Roman" w:cs="Times New Roman" w:eastAsia="Times New Roman" w:hAnsi="Times New Roman"/>
-                <w:b/>
-                <w:bCs/>
-                <w:sz w:val="20"/>
-                <w:szCs w:val="20"/>
-              </w:rPr>
-              <w:t xml:space="preserve">Neutral minus gain, pp [95% CI]</w:t>
-            </w:r>
-          </w:p>
-        </w:tc>
-        <w:tc>
-          <w:tcPr>
-            <w:tcW w:type="dxa" w:w="1300"/>
-            <w:tcBorders>
-              <w:top w:val="single" w:color="000000" w:sz="4"/>
-              <w:left w:val="none" w:color="FFFFFF" w:sz="0"/>
-              <w:bottom w:val="single" w:color="000000" w:sz="4"/>
-              <w:right w:val="none" w:color="FFFFFF" w:sz="0"/>
-            </w:tcBorders>
-            <w:shd w:fill="FFFFFF" w:color="auto" w:val="clear"/>
-            <w:tcMar>
-              <w:top w:type="dxa" w:w="40"/>
-              <w:left w:type="dxa" w:w="80"/>
-              <w:bottom w:type="dxa" w:w="40"/>
-              <w:right w:type="dxa" w:w="80"/>
-            </w:tcMar>
-          </w:tcPr>
-          <w:p>
-            <w:pPr>
-              <w:spacing w:after="0" w:before="0" w:line="240"/>
-              <w:jc w:val="center"/>
-            </w:pPr>
-            <w:r>
-              <w:rPr>
-                <w:rFonts w:ascii="Times New Roman" w:cs="Times New Roman" w:eastAsia="Times New Roman" w:hAnsi="Times New Roman"/>
-                <w:b/>
-                <w:bCs/>
-                <w:sz w:val="20"/>
-                <w:szCs w:val="20"/>
-              </w:rPr>
-              <w:t xml:space="preserve">Loss above gain (below)</w:t>
-            </w:r>
-          </w:p>
-        </w:tc>
-        <w:tc>
-          <w:tcPr>
-            <w:tcW w:type="dxa" w:w="2060"/>
-            <w:tcBorders>
-              <w:top w:val="single" w:color="000000" w:sz="4"/>
-              <w:left w:val="none" w:color="FFFFFF" w:sz="0"/>
-              <w:bottom w:val="single" w:color="000000" w:sz="4"/>
-              <w:right w:val="none" w:color="FFFFFF" w:sz="0"/>
-            </w:tcBorders>
-            <w:shd w:fill="FFFFFF" w:color="auto" w:val="clear"/>
-            <w:tcMar>
-              <w:top w:type="dxa" w:w="40"/>
-              <w:left w:type="dxa" w:w="80"/>
-              <w:bottom w:type="dxa" w:w="40"/>
-              <w:right w:type="dxa" w:w="80"/>
-            </w:tcMar>
-          </w:tcPr>
-          <w:p>
-            <w:pPr>
-              <w:spacing w:after="0" w:before="0" w:line="240"/>
-              <w:jc w:val="center"/>
-            </w:pPr>
-            <w:r>
-              <w:rPr>
-                <w:rFonts w:ascii="Times New Roman" w:cs="Times New Roman" w:eastAsia="Times New Roman" w:hAnsi="Times New Roman"/>
-                <w:b/>
-                <w:bCs/>
-                <w:sz w:val="20"/>
-                <w:szCs w:val="20"/>
-              </w:rPr>
-              <w:t xml:space="preserve">Frame / wording / interaction (noise floor)</w:t>
-            </w:r>
-          </w:p>
-        </w:tc>
-      </w:tr>
-      <w:tr>
-        <w:trPr>
-          <w:cantSplit/>
-          <w:tblHeader w:val="off"/>
-        </w:trPr>
-        <w:tc>
-          <w:tcPr>
-            <w:tcW w:type="dxa" w:w="900"/>
-            <w:tcBorders>
-              <w:top w:val="none" w:color="FFFFFF" w:sz="0"/>
-              <w:left w:val="none" w:color="FFFFFF" w:sz="0"/>
-              <w:bottom w:val="none" w:color="FFFFFF" w:sz="0"/>
-              <w:right w:val="none" w:color="FFFFFF" w:sz="0"/>
-            </w:tcBorders>
-            <w:shd w:fill="FFFFFF" w:color="auto" w:val="clear"/>
-            <w:tcMar>
-              <w:top w:type="dxa" w:w="40"/>
-              <w:left w:type="dxa" w:w="80"/>
-              <w:bottom w:type="dxa" w:w="40"/>
-              <w:right w:type="dxa" w:w="80"/>
-            </w:tcMar>
-          </w:tcPr>
-          <w:p>
-            <w:pPr>
-              <w:spacing w:after="0" w:before="0" w:line="240"/>
-              <w:jc w:val="left"/>
-            </w:pPr>
-            <w:r>
-              <w:rPr>
-                <w:rFonts w:ascii="Times New Roman" w:cs="Times New Roman" w:eastAsia="Times New Roman" w:hAnsi="Times New Roman"/>
-                <w:sz w:val="20"/>
-                <w:szCs w:val="20"/>
-              </w:rPr>
-              <w:t xml:space="preserve">12</w:t>
-            </w:r>
-          </w:p>
-        </w:tc>
-        <w:tc>
-          <w:tcPr>
-            <w:tcW w:type="dxa" w:w="1700"/>
-            <w:tcBorders>
-              <w:top w:val="none" w:color="FFFFFF" w:sz="0"/>
-              <w:left w:val="none" w:color="FFFFFF" w:sz="0"/>
-              <w:bottom w:val="none" w:color="FFFFFF" w:sz="0"/>
-              <w:right w:val="none" w:color="FFFFFF" w:sz="0"/>
-            </w:tcBorders>
-            <w:shd w:fill="FFFFFF" w:color="auto" w:val="clear"/>
-            <w:tcMar>
-              <w:top w:type="dxa" w:w="40"/>
-              <w:left w:type="dxa" w:w="80"/>
-              <w:bottom w:type="dxa" w:w="40"/>
-              <w:right w:type="dxa" w:w="80"/>
-            </w:tcMar>
-          </w:tcPr>
-          <w:p>
-            <w:pPr>
-              <w:spacing w:after="0" w:before="0" w:line="240"/>
-              <w:jc w:val="center"/>
-            </w:pPr>
-            <w:r>
-              <w:rPr>
-                <w:rFonts w:ascii="Times New Roman" w:cs="Times New Roman" w:eastAsia="Times New Roman" w:hAnsi="Times New Roman"/>
-                <w:sz w:val="20"/>
-                <w:szCs w:val="20"/>
-              </w:rPr>
-              <w:t xml:space="preserve">0.3% (0.0%-3.3%)</w:t>
-            </w:r>
-          </w:p>
-        </w:tc>
-        <w:tc>
-          <w:tcPr>
-            <w:tcW w:type="dxa" w:w="1700"/>
-            <w:tcBorders>
-              <w:top w:val="none" w:color="FFFFFF" w:sz="0"/>
-              <w:left w:val="none" w:color="FFFFFF" w:sz="0"/>
-              <w:bottom w:val="none" w:color="FFFFFF" w:sz="0"/>
-              <w:right w:val="none" w:color="FFFFFF" w:sz="0"/>
-            </w:tcBorders>
-            <w:shd w:fill="FFFFFF" w:color="auto" w:val="clear"/>
-            <w:tcMar>
-              <w:top w:type="dxa" w:w="40"/>
-              <w:left w:type="dxa" w:w="80"/>
-              <w:bottom w:type="dxa" w:w="40"/>
-              <w:right w:type="dxa" w:w="80"/>
-            </w:tcMar>
-          </w:tcPr>
-          <w:p>
-            <w:pPr>
-              <w:spacing w:after="0" w:before="0" w:line="240"/>
-              <w:jc w:val="center"/>
-            </w:pPr>
-            <w:r>
-              <w:rPr>
-                <w:rFonts w:ascii="Times New Roman" w:cs="Times New Roman" w:eastAsia="Times New Roman" w:hAnsi="Times New Roman"/>
-                <w:sz w:val="20"/>
-                <w:szCs w:val="20"/>
-              </w:rPr>
-              <w:t xml:space="preserve">-0.4 [-1.0, 0.0]</w:t>
-            </w:r>
-          </w:p>
-        </w:tc>
-        <w:tc>
-          <w:tcPr>
-            <w:tcW w:type="dxa" w:w="1700"/>
-            <w:tcBorders>
-              <w:top w:val="none" w:color="FFFFFF" w:sz="0"/>
-              <w:left w:val="none" w:color="FFFFFF" w:sz="0"/>
-              <w:bottom w:val="none" w:color="FFFFFF" w:sz="0"/>
-              <w:right w:val="none" w:color="FFFFFF" w:sz="0"/>
-            </w:tcBorders>
-            <w:shd w:fill="FFFFFF" w:color="auto" w:val="clear"/>
-            <w:tcMar>
-              <w:top w:type="dxa" w:w="40"/>
-              <w:left w:type="dxa" w:w="80"/>
-              <w:bottom w:type="dxa" w:w="40"/>
-              <w:right w:type="dxa" w:w="80"/>
-            </w:tcMar>
-          </w:tcPr>
-          <w:p>
-            <w:pPr>
-              <w:spacing w:after="0" w:before="0" w:line="240"/>
-              <w:jc w:val="center"/>
-            </w:pPr>
-            <w:r>
-              <w:rPr>
-                <w:rFonts w:ascii="Times New Roman" w:cs="Times New Roman" w:eastAsia="Times New Roman" w:hAnsi="Times New Roman"/>
-                <w:sz w:val="20"/>
-                <w:szCs w:val="20"/>
-              </w:rPr>
-              <w:t xml:space="preserve">0.0 [-0.8, +0.8]</w:t>
-            </w:r>
-          </w:p>
-        </w:tc>
-        <w:tc>
-          <w:tcPr>
-            <w:tcW w:type="dxa" w:w="1300"/>
-            <w:tcBorders>
-              <w:top w:val="none" w:color="FFFFFF" w:sz="0"/>
-              <w:left w:val="none" w:color="FFFFFF" w:sz="0"/>
-              <w:bottom w:val="none" w:color="FFFFFF" w:sz="0"/>
-              <w:right w:val="none" w:color="FFFFFF" w:sz="0"/>
-            </w:tcBorders>
-            <w:shd w:fill="FFFFFF" w:color="auto" w:val="clear"/>
-            <w:tcMar>
-              <w:top w:type="dxa" w:w="40"/>
-              <w:left w:type="dxa" w:w="80"/>
-              <w:bottom w:type="dxa" w:w="40"/>
-              <w:right w:type="dxa" w:w="80"/>
-            </w:tcMar>
-          </w:tcPr>
-          <w:p>
-            <w:pPr>
-              <w:spacing w:after="0" w:before="0" w:line="240"/>
-              <w:jc w:val="center"/>
-            </w:pPr>
-            <w:r>
-              <w:rPr>
-                <w:rFonts w:ascii="Times New Roman" w:cs="Times New Roman" w:eastAsia="Times New Roman" w:hAnsi="Times New Roman"/>
-                <w:sz w:val="20"/>
-                <w:szCs w:val="20"/>
-              </w:rPr>
-              <w:t xml:space="preserve">0 of 16 (2)</w:t>
-            </w:r>
-          </w:p>
-        </w:tc>
-        <w:tc>
-          <w:tcPr>
-            <w:tcW w:type="dxa" w:w="2060"/>
-            <w:tcBorders>
-              <w:top w:val="none" w:color="FFFFFF" w:sz="0"/>
-              <w:left w:val="none" w:color="FFFFFF" w:sz="0"/>
-              <w:bottom w:val="none" w:color="FFFFFF" w:sz="0"/>
-              <w:right w:val="none" w:color="FFFFFF" w:sz="0"/>
-            </w:tcBorders>
-            <w:shd w:fill="FFFFFF" w:color="auto" w:val="clear"/>
-            <w:tcMar>
-              <w:top w:type="dxa" w:w="40"/>
-              <w:left w:type="dxa" w:w="80"/>
-              <w:bottom w:type="dxa" w:w="40"/>
-              <w:right w:type="dxa" w:w="80"/>
-            </w:tcMar>
-          </w:tcPr>
-          <w:p>
-            <w:pPr>
-              <w:spacing w:after="0" w:before="0" w:line="240"/>
-              <w:jc w:val="center"/>
-            </w:pPr>
-            <w:r>
-              <w:rPr>
-                <w:rFonts w:ascii="Times New Roman" w:cs="Times New Roman" w:eastAsia="Times New Roman" w:hAnsi="Times New Roman"/>
-                <w:sz w:val="20"/>
-                <w:szCs w:val="20"/>
-              </w:rPr>
-              <w:t xml:space="preserve">4.5% / 27.3% / 68.2% (98.9%)</w:t>
-            </w:r>
-          </w:p>
-        </w:tc>
-      </w:tr>
-      <w:tr>
-        <w:trPr>
-          <w:cantSplit/>
-          <w:tblHeader w:val="off"/>
-        </w:trPr>
-        <w:tc>
-          <w:tcPr>
-            <w:tcW w:type="dxa" w:w="900"/>
-            <w:tcBorders>
-              <w:top w:val="none" w:color="FFFFFF" w:sz="0"/>
-              <w:left w:val="none" w:color="FFFFFF" w:sz="0"/>
-              <w:bottom w:val="none" w:color="FFFFFF" w:sz="0"/>
-              <w:right w:val="none" w:color="FFFFFF" w:sz="0"/>
-            </w:tcBorders>
-            <w:shd w:fill="FFFFFF" w:color="auto" w:val="clear"/>
-            <w:tcMar>
-              <w:top w:type="dxa" w:w="40"/>
-              <w:left w:type="dxa" w:w="80"/>
-              <w:bottom w:type="dxa" w:w="40"/>
-              <w:right w:type="dxa" w:w="80"/>
-            </w:tcMar>
-          </w:tcPr>
-          <w:p>
-            <w:pPr>
-              <w:spacing w:after="0" w:before="0" w:line="240"/>
-              <w:jc w:val="left"/>
-            </w:pPr>
-            <w:r>
-              <w:rPr>
-                <w:rFonts w:ascii="Times New Roman" w:cs="Times New Roman" w:eastAsia="Times New Roman" w:hAnsi="Times New Roman"/>
-                <w:sz w:val="20"/>
-                <w:szCs w:val="20"/>
-              </w:rPr>
-              <w:t xml:space="preserve">6</w:t>
-            </w:r>
-          </w:p>
-        </w:tc>
-        <w:tc>
-          <w:tcPr>
-            <w:tcW w:type="dxa" w:w="1700"/>
-            <w:tcBorders>
-              <w:top w:val="none" w:color="FFFFFF" w:sz="0"/>
-              <w:left w:val="none" w:color="FFFFFF" w:sz="0"/>
-              <w:bottom w:val="none" w:color="FFFFFF" w:sz="0"/>
-              <w:right w:val="none" w:color="FFFFFF" w:sz="0"/>
-            </w:tcBorders>
-            <w:shd w:fill="FFFFFF" w:color="auto" w:val="clear"/>
-            <w:tcMar>
-              <w:top w:type="dxa" w:w="40"/>
-              <w:left w:type="dxa" w:w="80"/>
-              <w:bottom w:type="dxa" w:w="40"/>
-              <w:right w:type="dxa" w:w="80"/>
-            </w:tcMar>
-          </w:tcPr>
-          <w:p>
-            <w:pPr>
-              <w:spacing w:after="0" w:before="0" w:line="240"/>
-              <w:jc w:val="center"/>
-            </w:pPr>
-            <w:r>
-              <w:rPr>
-                <w:rFonts w:ascii="Times New Roman" w:cs="Times New Roman" w:eastAsia="Times New Roman" w:hAnsi="Times New Roman"/>
-                <w:sz w:val="20"/>
-                <w:szCs w:val="20"/>
-              </w:rPr>
-              <w:t xml:space="preserve">1.5% (0.0%-16.7%)</w:t>
-            </w:r>
-          </w:p>
-        </w:tc>
-        <w:tc>
-          <w:tcPr>
-            <w:tcW w:type="dxa" w:w="1700"/>
-            <w:tcBorders>
-              <w:top w:val="none" w:color="FFFFFF" w:sz="0"/>
-              <w:left w:val="none" w:color="FFFFFF" w:sz="0"/>
-              <w:bottom w:val="none" w:color="FFFFFF" w:sz="0"/>
-              <w:right w:val="none" w:color="FFFFFF" w:sz="0"/>
-            </w:tcBorders>
-            <w:shd w:fill="FFFFFF" w:color="auto" w:val="clear"/>
-            <w:tcMar>
-              <w:top w:type="dxa" w:w="40"/>
-              <w:left w:type="dxa" w:w="80"/>
-              <w:bottom w:type="dxa" w:w="40"/>
-              <w:right w:type="dxa" w:w="80"/>
-            </w:tcMar>
-          </w:tcPr>
-          <w:p>
-            <w:pPr>
-              <w:spacing w:after="0" w:before="0" w:line="240"/>
-              <w:jc w:val="center"/>
-            </w:pPr>
-            <w:r>
-              <w:rPr>
-                <w:rFonts w:ascii="Times New Roman" w:cs="Times New Roman" w:eastAsia="Times New Roman" w:hAnsi="Times New Roman"/>
-                <w:sz w:val="20"/>
-                <w:szCs w:val="20"/>
-              </w:rPr>
-              <w:t xml:space="preserve">-1.9 [-4.6, +0.6]</w:t>
-            </w:r>
-          </w:p>
-        </w:tc>
-        <w:tc>
-          <w:tcPr>
-            <w:tcW w:type="dxa" w:w="1700"/>
-            <w:tcBorders>
-              <w:top w:val="none" w:color="FFFFFF" w:sz="0"/>
-              <w:left w:val="none" w:color="FFFFFF" w:sz="0"/>
-              <w:bottom w:val="none" w:color="FFFFFF" w:sz="0"/>
-              <w:right w:val="none" w:color="FFFFFF" w:sz="0"/>
-            </w:tcBorders>
-            <w:shd w:fill="FFFFFF" w:color="auto" w:val="clear"/>
-            <w:tcMar>
-              <w:top w:type="dxa" w:w="40"/>
-              <w:left w:type="dxa" w:w="80"/>
-              <w:bottom w:type="dxa" w:w="40"/>
-              <w:right w:type="dxa" w:w="80"/>
-            </w:tcMar>
-          </w:tcPr>
-          <w:p>
-            <w:pPr>
-              <w:spacing w:after="0" w:before="0" w:line="240"/>
-              <w:jc w:val="center"/>
-            </w:pPr>
-            <w:r>
-              <w:rPr>
-                <w:rFonts w:ascii="Times New Roman" w:cs="Times New Roman" w:eastAsia="Times New Roman" w:hAnsi="Times New Roman"/>
-                <w:sz w:val="20"/>
-                <w:szCs w:val="20"/>
-              </w:rPr>
-              <w:t xml:space="preserve">-1.9 [-4.2, -0.4]</w:t>
-            </w:r>
-          </w:p>
-        </w:tc>
-        <w:tc>
-          <w:tcPr>
-            <w:tcW w:type="dxa" w:w="1300"/>
-            <w:tcBorders>
-              <w:top w:val="none" w:color="FFFFFF" w:sz="0"/>
-              <w:left w:val="none" w:color="FFFFFF" w:sz="0"/>
-              <w:bottom w:val="none" w:color="FFFFFF" w:sz="0"/>
-              <w:right w:val="none" w:color="FFFFFF" w:sz="0"/>
-            </w:tcBorders>
-            <w:shd w:fill="FFFFFF" w:color="auto" w:val="clear"/>
-            <w:tcMar>
-              <w:top w:type="dxa" w:w="40"/>
-              <w:left w:type="dxa" w:w="80"/>
-              <w:bottom w:type="dxa" w:w="40"/>
-              <w:right w:type="dxa" w:w="80"/>
-            </w:tcMar>
-          </w:tcPr>
-          <w:p>
-            <w:pPr>
-              <w:spacing w:after="0" w:before="0" w:line="240"/>
-              <w:jc w:val="center"/>
-            </w:pPr>
-            <w:r>
-              <w:rPr>
-                <w:rFonts w:ascii="Times New Roman" w:cs="Times New Roman" w:eastAsia="Times New Roman" w:hAnsi="Times New Roman"/>
-                <w:sz w:val="20"/>
-                <w:szCs w:val="20"/>
-              </w:rPr>
-              <w:t xml:space="preserve">3 of 16 (6)</w:t>
-            </w:r>
-          </w:p>
-        </w:tc>
-        <w:tc>
-          <w:tcPr>
-            <w:tcW w:type="dxa" w:w="2060"/>
-            <w:tcBorders>
-              <w:top w:val="none" w:color="FFFFFF" w:sz="0"/>
-              <w:left w:val="none" w:color="FFFFFF" w:sz="0"/>
-              <w:bottom w:val="none" w:color="FFFFFF" w:sz="0"/>
-              <w:right w:val="none" w:color="FFFFFF" w:sz="0"/>
-            </w:tcBorders>
-            <w:shd w:fill="FFFFFF" w:color="auto" w:val="clear"/>
-            <w:tcMar>
-              <w:top w:type="dxa" w:w="40"/>
-              <w:left w:type="dxa" w:w="80"/>
-              <w:bottom w:type="dxa" w:w="40"/>
-              <w:right w:type="dxa" w:w="80"/>
-            </w:tcMar>
-          </w:tcPr>
-          <w:p>
-            <w:pPr>
-              <w:spacing w:after="0" w:before="0" w:line="240"/>
-              <w:jc w:val="center"/>
-            </w:pPr>
-            <w:r>
-              <w:rPr>
-                <w:rFonts w:ascii="Times New Roman" w:cs="Times New Roman" w:eastAsia="Times New Roman" w:hAnsi="Times New Roman"/>
-                <w:sz w:val="20"/>
-                <w:szCs w:val="20"/>
-              </w:rPr>
-              <w:t xml:space="preserve">7.1% / 35.9% / 57.1% (37.5%)</w:t>
-            </w:r>
-          </w:p>
-        </w:tc>
-      </w:tr>
-      <w:tr>
-        <w:trPr>
-          <w:cantSplit/>
-          <w:tblHeader w:val="off"/>
-        </w:trPr>
-        <w:tc>
-          <w:tcPr>
-            <w:tcW w:type="dxa" w:w="900"/>
-            <w:tcBorders>
-              <w:top w:val="none" w:color="FFFFFF" w:sz="0"/>
-              <w:left w:val="none" w:color="FFFFFF" w:sz="0"/>
-              <w:bottom w:val="none" w:color="FFFFFF" w:sz="0"/>
-              <w:right w:val="none" w:color="FFFFFF" w:sz="0"/>
-            </w:tcBorders>
-            <w:shd w:fill="FFFFFF" w:color="auto" w:val="clear"/>
-            <w:tcMar>
-              <w:top w:type="dxa" w:w="40"/>
-              <w:left w:type="dxa" w:w="80"/>
-              <w:bottom w:type="dxa" w:w="40"/>
-              <w:right w:type="dxa" w:w="80"/>
-            </w:tcMar>
-          </w:tcPr>
-          <w:p>
-            <w:pPr>
-              <w:spacing w:after="0" w:before="0" w:line="240"/>
-              <w:jc w:val="left"/>
-            </w:pPr>
-            <w:r>
-              <w:rPr>
-                <w:rFonts w:ascii="Times New Roman" w:cs="Times New Roman" w:eastAsia="Times New Roman" w:hAnsi="Times New Roman"/>
-                <w:sz w:val="20"/>
-                <w:szCs w:val="20"/>
-              </w:rPr>
-              <w:t xml:space="preserve">3</w:t>
-            </w:r>
-          </w:p>
-        </w:tc>
-        <w:tc>
-          <w:tcPr>
-            <w:tcW w:type="dxa" w:w="1700"/>
-            <w:tcBorders>
-              <w:top w:val="none" w:color="FFFFFF" w:sz="0"/>
-              <w:left w:val="none" w:color="FFFFFF" w:sz="0"/>
-              <w:bottom w:val="none" w:color="FFFFFF" w:sz="0"/>
-              <w:right w:val="none" w:color="FFFFFF" w:sz="0"/>
-            </w:tcBorders>
-            <w:shd w:fill="FFFFFF" w:color="auto" w:val="clear"/>
-            <w:tcMar>
-              <w:top w:type="dxa" w:w="40"/>
-              <w:left w:type="dxa" w:w="80"/>
-              <w:bottom w:type="dxa" w:w="40"/>
-              <w:right w:type="dxa" w:w="80"/>
-            </w:tcMar>
-          </w:tcPr>
-          <w:p>
-            <w:pPr>
-              <w:spacing w:after="0" w:before="0" w:line="240"/>
-              <w:jc w:val="center"/>
-            </w:pPr>
-            <w:r>
-              <w:rPr>
-                <w:rFonts w:ascii="Times New Roman" w:cs="Times New Roman" w:eastAsia="Times New Roman" w:hAnsi="Times New Roman"/>
-                <w:sz w:val="20"/>
-                <w:szCs w:val="20"/>
-              </w:rPr>
-              <w:t xml:space="preserve">17.2% (0.0%-100.0%)</w:t>
-            </w:r>
-          </w:p>
-        </w:tc>
-        <w:tc>
-          <w:tcPr>
-            <w:tcW w:type="dxa" w:w="1700"/>
-            <w:tcBorders>
-              <w:top w:val="none" w:color="FFFFFF" w:sz="0"/>
-              <w:left w:val="none" w:color="FFFFFF" w:sz="0"/>
-              <w:bottom w:val="none" w:color="FFFFFF" w:sz="0"/>
-              <w:right w:val="none" w:color="FFFFFF" w:sz="0"/>
-            </w:tcBorders>
-            <w:shd w:fill="FFFFFF" w:color="auto" w:val="clear"/>
-            <w:tcMar>
-              <w:top w:type="dxa" w:w="40"/>
-              <w:left w:type="dxa" w:w="80"/>
-              <w:bottom w:type="dxa" w:w="40"/>
-              <w:right w:type="dxa" w:w="80"/>
-            </w:tcMar>
-          </w:tcPr>
-          <w:p>
-            <w:pPr>
-              <w:spacing w:after="0" w:before="0" w:line="240"/>
-              <w:jc w:val="center"/>
-            </w:pPr>
-            <w:r>
-              <w:rPr>
-                <w:rFonts w:ascii="Times New Roman" w:cs="Times New Roman" w:eastAsia="Times New Roman" w:hAnsi="Times New Roman"/>
-                <w:sz w:val="20"/>
-                <w:szCs w:val="20"/>
-              </w:rPr>
-              <w:t xml:space="preserve">-26.2 [-41.5, -12.9]</w:t>
-            </w:r>
-          </w:p>
-        </w:tc>
-        <w:tc>
-          <w:tcPr>
-            <w:tcW w:type="dxa" w:w="1700"/>
-            <w:tcBorders>
-              <w:top w:val="none" w:color="FFFFFF" w:sz="0"/>
-              <w:left w:val="none" w:color="FFFFFF" w:sz="0"/>
-              <w:bottom w:val="none" w:color="FFFFFF" w:sz="0"/>
-              <w:right w:val="none" w:color="FFFFFF" w:sz="0"/>
-            </w:tcBorders>
-            <w:shd w:fill="FFFFFF" w:color="auto" w:val="clear"/>
-            <w:tcMar>
-              <w:top w:type="dxa" w:w="40"/>
-              <w:left w:type="dxa" w:w="80"/>
-              <w:bottom w:type="dxa" w:w="40"/>
-              <w:right w:type="dxa" w:w="80"/>
-            </w:tcMar>
-          </w:tcPr>
-          <w:p>
-            <w:pPr>
-              <w:spacing w:after="0" w:before="0" w:line="240"/>
-              <w:jc w:val="center"/>
-            </w:pPr>
-            <w:r>
-              <w:rPr>
-                <w:rFonts w:ascii="Times New Roman" w:cs="Times New Roman" w:eastAsia="Times New Roman" w:hAnsi="Times New Roman"/>
-                <w:sz w:val="20"/>
-                <w:szCs w:val="20"/>
-              </w:rPr>
-              <w:t xml:space="preserve">-14.0 [-27.1, -1.7]</w:t>
-            </w:r>
-          </w:p>
-        </w:tc>
-        <w:tc>
-          <w:tcPr>
-            <w:tcW w:type="dxa" w:w="1300"/>
-            <w:tcBorders>
-              <w:top w:val="none" w:color="FFFFFF" w:sz="0"/>
-              <w:left w:val="none" w:color="FFFFFF" w:sz="0"/>
-              <w:bottom w:val="none" w:color="FFFFFF" w:sz="0"/>
-              <w:right w:val="none" w:color="FFFFFF" w:sz="0"/>
-            </w:tcBorders>
-            <w:shd w:fill="FFFFFF" w:color="auto" w:val="clear"/>
-            <w:tcMar>
-              <w:top w:type="dxa" w:w="40"/>
-              <w:left w:type="dxa" w:w="80"/>
-              <w:bottom w:type="dxa" w:w="40"/>
-              <w:right w:type="dxa" w:w="80"/>
-            </w:tcMar>
-          </w:tcPr>
-          <w:p>
-            <w:pPr>
-              <w:spacing w:after="0" w:before="0" w:line="240"/>
-              <w:jc w:val="center"/>
-            </w:pPr>
-            <w:r>
-              <w:rPr>
-                <w:rFonts w:ascii="Times New Roman" w:cs="Times New Roman" w:eastAsia="Times New Roman" w:hAnsi="Times New Roman"/>
-                <w:sz w:val="20"/>
-                <w:szCs w:val="20"/>
-              </w:rPr>
-              <w:t xml:space="preserve">1 of 16 (11)</w:t>
-            </w:r>
-          </w:p>
-        </w:tc>
-        <w:tc>
-          <w:tcPr>
-            <w:tcW w:type="dxa" w:w="2060"/>
-            <w:tcBorders>
-              <w:top w:val="none" w:color="FFFFFF" w:sz="0"/>
-              <w:left w:val="none" w:color="FFFFFF" w:sz="0"/>
-              <w:bottom w:val="none" w:color="FFFFFF" w:sz="0"/>
-              <w:right w:val="none" w:color="FFFFFF" w:sz="0"/>
-            </w:tcBorders>
-            <w:shd w:fill="FFFFFF" w:color="auto" w:val="clear"/>
-            <w:tcMar>
-              <w:top w:type="dxa" w:w="40"/>
-              <w:left w:type="dxa" w:w="80"/>
-              <w:bottom w:type="dxa" w:w="40"/>
-              <w:right w:type="dxa" w:w="80"/>
-            </w:tcMar>
-          </w:tcPr>
-          <w:p>
-            <w:pPr>
-              <w:spacing w:after="0" w:before="0" w:line="240"/>
-              <w:jc w:val="center"/>
-            </w:pPr>
-            <w:r>
-              <w:rPr>
-                <w:rFonts w:ascii="Times New Roman" w:cs="Times New Roman" w:eastAsia="Times New Roman" w:hAnsi="Times New Roman"/>
-                <w:sz w:val="20"/>
-                <w:szCs w:val="20"/>
-              </w:rPr>
-              <w:t xml:space="preserve">16.1% / 47.6% / 36.3% (3.1%)</w:t>
-            </w:r>
-          </w:p>
-        </w:tc>
-      </w:tr>
-    </w:tbl>
-    <w:p>
-      <w:pPr>
-        <w:spacing w:after="240" w:before="60" w:line="240"/>
-      </w:pPr>
-      <w:r>
-        <w:rPr>
-          <w:rFonts w:ascii="Times New Roman" w:cs="Times New Roman" w:eastAsia="Times New Roman" w:hAnsi="Times New Roman"/>
-          <w:i/>
-          <w:iCs/>
-          <w:sz w:val="20"/>
-          <w:szCs w:val="20"/>
-        </w:rPr>
-        <w:t xml:space="preserve">Note.</w:t>
-      </w:r>
-      <w:r>
-        <w:rPr>
-          <w:rFonts w:ascii="Times New Roman" w:cs="Times New Roman" w:eastAsia="Times New Roman" w:hAnsi="Times New Roman"/>
-          <w:sz w:val="20"/>
-          <w:szCs w:val="20"/>
-        </w:rPr>
-        <w:t xml:space="preserve"> Intervals resample wordings. Parse failures in the three conditions: 1, 8, and 3 of 1,440.</w:t>
+        <w:t xml:space="preserve">Gemini 2.5 Flash-Lite skipped under time pressure only (0.3%, 1.5%, and 17.2% of first choices at twelve, six, and three turns left). In the Study 4 design, stating the target in the headline raised skipping when the target was not in the facts line (+6.9 points [+0.2, +18.1] with neutral wording and +6.0 [+1.5, +12.7] with loss wording), loss text did not raise it (loss minus neutral +0.0 [-0.6, +0.6] without a target statement and -15.4 [-29.4, -4.0] with one), and the registered contrast was negative in both runs (-29.2 [-44.2, -14.6] and -20.8 [-35.4, -8.3]). Online Appendix F gives the tables and the full results.</w:t>
       </w:r>
     </w:p>
     <w:p>
@@ -15839,11 +14967,12 @@
           <w:sz w:val="24"/>
           <w:szCs w:val="24"/>
         </w:rPr>
-        <w:t xml:space="preserve">The Study 4 design gave a similar picture (Tables 12 and 13). With the target left out of the facts line, the neutral and loss frames almost never skipped (0.2% each), the gain frame, which states the target in the headline, skipped in 21.0%, and adding the target headline to the neutral and loss wordings raised skipping by 6.9 points [+0.2, +18.1] and 6.0 points [+1.5, +12.7]. Loss text without a target statement did not differ from neutral text (+0.0 [-0.6, +0.6]). With the target in the facts line, loss text lowered skipping relative to neutral text (-15.4 [-29.4, -4.0]) and the target headline raised it for the loss wording (+9.6 [+1.0, +21.3]) but not for the neutral wording (+0.4 [-10.2, +11.9]); the interaction (+9.2 [-4.2, +21.9]) was not distinguishable from zero. The registered contrast, loss minus gain, was negative in both runs (-29.2 [-44.2, -14.6] and -20.8 [-35.4, -8.3]). Without the target in the facts line this model chose hold in 61% of first choices, against 10% when the target was stated, which is consistent with an operator that has no target to reach and therefore waits.</w:t>
+        <w:t xml:space="preserve">Two cautions apply. The intervals are 95% intervals over wordings and are not adjusted for multiplicity, as in Studies 2 to 5. And one of seven models passing the screen is a modest base for generalization: the pattern is present in two small models from two vendors, with a smaller frame difference in the second (-26.2 against -62.9 points at three turns left), and it is absent or too small to estimate in the others. We therefore do not claim that it holds for small models in general.</w:t>
       </w:r>
     </w:p>
     <w:p>
       <w:pPr>
+        <w:pStyle w:val="Heading1"/>
         <w:keepNext/>
         <w:spacing w:after="0" w:before="0" w:line="480"/>
       </w:pPr>
@@ -15855,659 +14984,12 @@
           <w:sz w:val="24"/>
           <w:szCs w:val="24"/>
         </w:rPr>
-        <w:t xml:space="preserve">Table 12.</w:t>
-      </w:r>
-      <w:r>
-        <w:rPr>
-          <w:rFonts w:ascii="Times New Roman" w:cs="Times New Roman" w:eastAsia="Times New Roman" w:hAnsi="Times New Roman"/>
-          <w:sz w:val="24"/>
-          <w:szCs w:val="24"/>
-        </w:rPr>
-        <w:t xml:space="preserve"> Study 6: Gemini 2.5 Flash-Lite, skip rate by frame in the Study 4 design (mean over 16 wordings, three turns left).</w:t>
-      </w:r>
-    </w:p>
-    <w:tbl>
-      <w:tblPr>
-        <w:tblW w:type="dxa" w:w="9360"/>
-        <w:tblBorders>
-          <w:top w:val="single" w:color="auto" w:sz="4"/>
-          <w:left w:val="single" w:color="auto" w:sz="4"/>
-          <w:bottom w:val="single" w:color="auto" w:sz="4"/>
-          <w:right w:val="single" w:color="auto" w:sz="4"/>
-          <w:insideH w:val="single" w:color="auto" w:sz="4"/>
-          <w:insideV w:val="single" w:color="auto" w:sz="4"/>
-        </w:tblBorders>
-      </w:tblPr>
-      <w:tblGrid>
-        <w:gridCol w:w="2500"/>
-        <w:gridCol w:w="1200"/>
-        <w:gridCol w:w="1200"/>
-        <w:gridCol w:w="1300"/>
-        <w:gridCol w:w="1700"/>
-        <w:gridCol w:w="1460"/>
-      </w:tblGrid>
-      <w:tr>
-        <w:trPr>
-          <w:cantSplit/>
-          <w:tblHeader/>
-        </w:trPr>
-        <w:tc>
-          <w:tcPr>
-            <w:tcW w:type="dxa" w:w="2500"/>
-            <w:tcBorders>
-              <w:top w:val="single" w:color="000000" w:sz="4"/>
-              <w:left w:val="none" w:color="FFFFFF" w:sz="0"/>
-              <w:bottom w:val="single" w:color="000000" w:sz="4"/>
-              <w:right w:val="none" w:color="FFFFFF" w:sz="0"/>
-            </w:tcBorders>
-            <w:shd w:fill="FFFFFF" w:color="auto" w:val="clear"/>
-            <w:tcMar>
-              <w:top w:type="dxa" w:w="40"/>
-              <w:left w:type="dxa" w:w="80"/>
-              <w:bottom w:type="dxa" w:w="40"/>
-              <w:right w:type="dxa" w:w="80"/>
-            </w:tcMar>
-          </w:tcPr>
-          <w:p>
-            <w:pPr>
-              <w:spacing w:after="0" w:before="0" w:line="240"/>
-              <w:jc w:val="left"/>
-            </w:pPr>
-          </w:p>
-        </w:tc>
-        <w:tc>
-          <w:tcPr>
-            <w:tcW w:type="dxa" w:w="1200"/>
-            <w:tcBorders>
-              <w:top w:val="single" w:color="000000" w:sz="4"/>
-              <w:left w:val="none" w:color="FFFFFF" w:sz="0"/>
-              <w:bottom w:val="single" w:color="000000" w:sz="4"/>
-              <w:right w:val="none" w:color="FFFFFF" w:sz="0"/>
-            </w:tcBorders>
-            <w:shd w:fill="FFFFFF" w:color="auto" w:val="clear"/>
-            <w:tcMar>
-              <w:top w:type="dxa" w:w="40"/>
-              <w:left w:type="dxa" w:w="80"/>
-              <w:bottom w:type="dxa" w:w="40"/>
-              <w:right w:type="dxa" w:w="80"/>
-            </w:tcMar>
-          </w:tcPr>
-          <w:p>
-            <w:pPr>
-              <w:spacing w:after="0" w:before="0" w:line="240"/>
-              <w:jc w:val="center"/>
-            </w:pPr>
-            <w:r>
-              <w:rPr>
-                <w:rFonts w:ascii="Times New Roman" w:cs="Times New Roman" w:eastAsia="Times New Roman" w:hAnsi="Times New Roman"/>
-                <w:b/>
-                <w:bCs/>
-                <w:sz w:val="20"/>
-                <w:szCs w:val="20"/>
-              </w:rPr>
-              <w:t xml:space="preserve">Neutral</w:t>
-            </w:r>
-          </w:p>
-        </w:tc>
-        <w:tc>
-          <w:tcPr>
-            <w:tcW w:type="dxa" w:w="1200"/>
-            <w:tcBorders>
-              <w:top w:val="single" w:color="000000" w:sz="4"/>
-              <w:left w:val="none" w:color="FFFFFF" w:sz="0"/>
-              <w:bottom w:val="single" w:color="000000" w:sz="4"/>
-              <w:right w:val="none" w:color="FFFFFF" w:sz="0"/>
-            </w:tcBorders>
-            <w:shd w:fill="FFFFFF" w:color="auto" w:val="clear"/>
-            <w:tcMar>
-              <w:top w:type="dxa" w:w="40"/>
-              <w:left w:type="dxa" w:w="80"/>
-              <w:bottom w:type="dxa" w:w="40"/>
-              <w:right w:type="dxa" w:w="80"/>
-            </w:tcMar>
-          </w:tcPr>
-          <w:p>
-            <w:pPr>
-              <w:spacing w:after="0" w:before="0" w:line="240"/>
-              <w:jc w:val="center"/>
-            </w:pPr>
-            <w:r>
-              <w:rPr>
-                <w:rFonts w:ascii="Times New Roman" w:cs="Times New Roman" w:eastAsia="Times New Roman" w:hAnsi="Times New Roman"/>
-                <w:b/>
-                <w:bCs/>
-                <w:sz w:val="20"/>
-                <w:szCs w:val="20"/>
-              </w:rPr>
-              <w:t xml:space="preserve">Loss</w:t>
-            </w:r>
-          </w:p>
-        </w:tc>
-        <w:tc>
-          <w:tcPr>
-            <w:tcW w:type="dxa" w:w="1300"/>
-            <w:tcBorders>
-              <w:top w:val="single" w:color="000000" w:sz="4"/>
-              <w:left w:val="none" w:color="FFFFFF" w:sz="0"/>
-              <w:bottom w:val="single" w:color="000000" w:sz="4"/>
-              <w:right w:val="none" w:color="FFFFFF" w:sz="0"/>
-            </w:tcBorders>
-            <w:shd w:fill="FFFFFF" w:color="auto" w:val="clear"/>
-            <w:tcMar>
-              <w:top w:type="dxa" w:w="40"/>
-              <w:left w:type="dxa" w:w="80"/>
-              <w:bottom w:type="dxa" w:w="40"/>
-              <w:right w:type="dxa" w:w="80"/>
-            </w:tcMar>
-          </w:tcPr>
-          <w:p>
-            <w:pPr>
-              <w:spacing w:after="0" w:before="0" w:line="240"/>
-              <w:jc w:val="center"/>
-            </w:pPr>
-            <w:r>
-              <w:rPr>
-                <w:rFonts w:ascii="Times New Roman" w:cs="Times New Roman" w:eastAsia="Times New Roman" w:hAnsi="Times New Roman"/>
-                <w:b/>
-                <w:bCs/>
-                <w:sz w:val="20"/>
-                <w:szCs w:val="20"/>
-              </w:rPr>
-              <w:t xml:space="preserve">Gain</w:t>
-            </w:r>
-          </w:p>
-        </w:tc>
-        <w:tc>
-          <w:tcPr>
-            <w:tcW w:type="dxa" w:w="1700"/>
-            <w:tcBorders>
-              <w:top w:val="single" w:color="000000" w:sz="4"/>
-              <w:left w:val="none" w:color="FFFFFF" w:sz="0"/>
-              <w:bottom w:val="single" w:color="000000" w:sz="4"/>
-              <w:right w:val="none" w:color="FFFFFF" w:sz="0"/>
-            </w:tcBorders>
-            <w:shd w:fill="FFFFFF" w:color="auto" w:val="clear"/>
-            <w:tcMar>
-              <w:top w:type="dxa" w:w="40"/>
-              <w:left w:type="dxa" w:w="80"/>
-              <w:bottom w:type="dxa" w:w="40"/>
-              <w:right w:type="dxa" w:w="80"/>
-            </w:tcMar>
-          </w:tcPr>
-          <w:p>
-            <w:pPr>
-              <w:spacing w:after="0" w:before="0" w:line="240"/>
-              <w:jc w:val="center"/>
-            </w:pPr>
-            <w:r>
-              <w:rPr>
-                <w:rFonts w:ascii="Times New Roman" w:cs="Times New Roman" w:eastAsia="Times New Roman" w:hAnsi="Times New Roman"/>
-                <w:b/>
-                <w:bCs/>
-                <w:sz w:val="20"/>
-                <w:szCs w:val="20"/>
-              </w:rPr>
-              <w:t xml:space="preserve">Neutral + target</w:t>
-            </w:r>
-          </w:p>
-        </w:tc>
-        <w:tc>
-          <w:tcPr>
-            <w:tcW w:type="dxa" w:w="1460"/>
-            <w:tcBorders>
-              <w:top w:val="single" w:color="000000" w:sz="4"/>
-              <w:left w:val="none" w:color="FFFFFF" w:sz="0"/>
-              <w:bottom w:val="single" w:color="000000" w:sz="4"/>
-              <w:right w:val="none" w:color="FFFFFF" w:sz="0"/>
-            </w:tcBorders>
-            <w:shd w:fill="FFFFFF" w:color="auto" w:val="clear"/>
-            <w:tcMar>
-              <w:top w:type="dxa" w:w="40"/>
-              <w:left w:type="dxa" w:w="80"/>
-              <w:bottom w:type="dxa" w:w="40"/>
-              <w:right w:type="dxa" w:w="80"/>
-            </w:tcMar>
-          </w:tcPr>
-          <w:p>
-            <w:pPr>
-              <w:spacing w:after="0" w:before="0" w:line="240"/>
-              <w:jc w:val="center"/>
-            </w:pPr>
-            <w:r>
-              <w:rPr>
-                <w:rFonts w:ascii="Times New Roman" w:cs="Times New Roman" w:eastAsia="Times New Roman" w:hAnsi="Times New Roman"/>
-                <w:b/>
-                <w:bCs/>
-                <w:sz w:val="20"/>
-                <w:szCs w:val="20"/>
-              </w:rPr>
-              <w:t xml:space="preserve">Loss + target</w:t>
-            </w:r>
-          </w:p>
-        </w:tc>
-      </w:tr>
-      <w:tr>
-        <w:trPr>
-          <w:cantSplit/>
-          <w:tblHeader w:val="off"/>
-        </w:trPr>
-        <w:tc>
-          <w:tcPr>
-            <w:tcW w:type="dxa" w:w="2500"/>
-            <w:tcBorders>
-              <w:top w:val="none" w:color="FFFFFF" w:sz="0"/>
-              <w:left w:val="none" w:color="FFFFFF" w:sz="0"/>
-              <w:bottom w:val="none" w:color="FFFFFF" w:sz="0"/>
-              <w:right w:val="none" w:color="FFFFFF" w:sz="0"/>
-            </w:tcBorders>
-            <w:shd w:fill="FFFFFF" w:color="auto" w:val="clear"/>
-            <w:tcMar>
-              <w:top w:type="dxa" w:w="40"/>
-              <w:left w:type="dxa" w:w="80"/>
-              <w:bottom w:type="dxa" w:w="40"/>
-              <w:right w:type="dxa" w:w="80"/>
-            </w:tcMar>
-          </w:tcPr>
-          <w:p>
-            <w:pPr>
-              <w:spacing w:after="0" w:before="0" w:line="240"/>
-              <w:jc w:val="left"/>
-            </w:pPr>
-            <w:r>
-              <w:rPr>
-                <w:rFonts w:ascii="Times New Roman" w:cs="Times New Roman" w:eastAsia="Times New Roman" w:hAnsi="Times New Roman"/>
-                <w:sz w:val="20"/>
-                <w:szCs w:val="20"/>
-              </w:rPr>
-              <w:t xml:space="preserve">Target in the facts line</w:t>
-            </w:r>
-          </w:p>
-        </w:tc>
-        <w:tc>
-          <w:tcPr>
-            <w:tcW w:type="dxa" w:w="1200"/>
-            <w:tcBorders>
-              <w:top w:val="none" w:color="FFFFFF" w:sz="0"/>
-              <w:left w:val="none" w:color="FFFFFF" w:sz="0"/>
-              <w:bottom w:val="none" w:color="FFFFFF" w:sz="0"/>
-              <w:right w:val="none" w:color="FFFFFF" w:sz="0"/>
-            </w:tcBorders>
-            <w:shd w:fill="FFFFFF" w:color="auto" w:val="clear"/>
-            <w:tcMar>
-              <w:top w:type="dxa" w:w="40"/>
-              <w:left w:type="dxa" w:w="80"/>
-              <w:bottom w:type="dxa" w:w="40"/>
-              <w:right w:type="dxa" w:w="80"/>
-            </w:tcMar>
-          </w:tcPr>
-          <w:p>
-            <w:pPr>
-              <w:spacing w:after="0" w:before="0" w:line="240"/>
-              <w:jc w:val="center"/>
-            </w:pPr>
-            <w:r>
-              <w:rPr>
-                <w:rFonts w:ascii="Times New Roman" w:cs="Times New Roman" w:eastAsia="Times New Roman" w:hAnsi="Times New Roman"/>
-                <w:sz w:val="20"/>
-                <w:szCs w:val="20"/>
-              </w:rPr>
-              <w:t xml:space="preserve">18.3%</w:t>
-            </w:r>
-          </w:p>
-        </w:tc>
-        <w:tc>
-          <w:tcPr>
-            <w:tcW w:type="dxa" w:w="1200"/>
-            <w:tcBorders>
-              <w:top w:val="none" w:color="FFFFFF" w:sz="0"/>
-              <w:left w:val="none" w:color="FFFFFF" w:sz="0"/>
-              <w:bottom w:val="none" w:color="FFFFFF" w:sz="0"/>
-              <w:right w:val="none" w:color="FFFFFF" w:sz="0"/>
-            </w:tcBorders>
-            <w:shd w:fill="FFFFFF" w:color="auto" w:val="clear"/>
-            <w:tcMar>
-              <w:top w:type="dxa" w:w="40"/>
-              <w:left w:type="dxa" w:w="80"/>
-              <w:bottom w:type="dxa" w:w="40"/>
-              <w:right w:type="dxa" w:w="80"/>
-            </w:tcMar>
-          </w:tcPr>
-          <w:p>
-            <w:pPr>
-              <w:spacing w:after="0" w:before="0" w:line="240"/>
-              <w:jc w:val="center"/>
-            </w:pPr>
-            <w:r>
-              <w:rPr>
-                <w:rFonts w:ascii="Times New Roman" w:cs="Times New Roman" w:eastAsia="Times New Roman" w:hAnsi="Times New Roman"/>
-                <w:sz w:val="20"/>
-                <w:szCs w:val="20"/>
-              </w:rPr>
-              <w:t xml:space="preserve">2.9%</w:t>
-            </w:r>
-          </w:p>
-        </w:tc>
-        <w:tc>
-          <w:tcPr>
-            <w:tcW w:type="dxa" w:w="1300"/>
-            <w:tcBorders>
-              <w:top w:val="none" w:color="FFFFFF" w:sz="0"/>
-              <w:left w:val="none" w:color="FFFFFF" w:sz="0"/>
-              <w:bottom w:val="none" w:color="FFFFFF" w:sz="0"/>
-              <w:right w:val="none" w:color="FFFFFF" w:sz="0"/>
-            </w:tcBorders>
-            <w:shd w:fill="FFFFFF" w:color="auto" w:val="clear"/>
-            <w:tcMar>
-              <w:top w:type="dxa" w:w="40"/>
-              <w:left w:type="dxa" w:w="80"/>
-              <w:bottom w:type="dxa" w:w="40"/>
-              <w:right w:type="dxa" w:w="80"/>
-            </w:tcMar>
-          </w:tcPr>
-          <w:p>
-            <w:pPr>
-              <w:spacing w:after="0" w:before="0" w:line="240"/>
-              <w:jc w:val="center"/>
-            </w:pPr>
-            <w:r>
-              <w:rPr>
-                <w:rFonts w:ascii="Times New Roman" w:cs="Times New Roman" w:eastAsia="Times New Roman" w:hAnsi="Times New Roman"/>
-                <w:sz w:val="20"/>
-                <w:szCs w:val="20"/>
-              </w:rPr>
-              <w:t xml:space="preserve">32.1%</w:t>
-            </w:r>
-          </w:p>
-        </w:tc>
-        <w:tc>
-          <w:tcPr>
-            <w:tcW w:type="dxa" w:w="1700"/>
-            <w:tcBorders>
-              <w:top w:val="none" w:color="FFFFFF" w:sz="0"/>
-              <w:left w:val="none" w:color="FFFFFF" w:sz="0"/>
-              <w:bottom w:val="none" w:color="FFFFFF" w:sz="0"/>
-              <w:right w:val="none" w:color="FFFFFF" w:sz="0"/>
-            </w:tcBorders>
-            <w:shd w:fill="FFFFFF" w:color="auto" w:val="clear"/>
-            <w:tcMar>
-              <w:top w:type="dxa" w:w="40"/>
-              <w:left w:type="dxa" w:w="80"/>
-              <w:bottom w:type="dxa" w:w="40"/>
-              <w:right w:type="dxa" w:w="80"/>
-            </w:tcMar>
-          </w:tcPr>
-          <w:p>
-            <w:pPr>
-              <w:spacing w:after="0" w:before="0" w:line="240"/>
-              <w:jc w:val="center"/>
-            </w:pPr>
-            <w:r>
-              <w:rPr>
-                <w:rFonts w:ascii="Times New Roman" w:cs="Times New Roman" w:eastAsia="Times New Roman" w:hAnsi="Times New Roman"/>
-                <w:sz w:val="20"/>
-                <w:szCs w:val="20"/>
-              </w:rPr>
-              <w:t xml:space="preserve">18.8%</w:t>
-            </w:r>
-          </w:p>
-        </w:tc>
-        <w:tc>
-          <w:tcPr>
-            <w:tcW w:type="dxa" w:w="1460"/>
-            <w:tcBorders>
-              <w:top w:val="none" w:color="FFFFFF" w:sz="0"/>
-              <w:left w:val="none" w:color="FFFFFF" w:sz="0"/>
-              <w:bottom w:val="none" w:color="FFFFFF" w:sz="0"/>
-              <w:right w:val="none" w:color="FFFFFF" w:sz="0"/>
-            </w:tcBorders>
-            <w:shd w:fill="FFFFFF" w:color="auto" w:val="clear"/>
-            <w:tcMar>
-              <w:top w:type="dxa" w:w="40"/>
-              <w:left w:type="dxa" w:w="80"/>
-              <w:bottom w:type="dxa" w:w="40"/>
-              <w:right w:type="dxa" w:w="80"/>
-            </w:tcMar>
-          </w:tcPr>
-          <w:p>
-            <w:pPr>
-              <w:spacing w:after="0" w:before="0" w:line="240"/>
-              <w:jc w:val="center"/>
-            </w:pPr>
-            <w:r>
-              <w:rPr>
-                <w:rFonts w:ascii="Times New Roman" w:cs="Times New Roman" w:eastAsia="Times New Roman" w:hAnsi="Times New Roman"/>
-                <w:sz w:val="20"/>
-                <w:szCs w:val="20"/>
-              </w:rPr>
-              <w:t xml:space="preserve">12.5%</w:t>
-            </w:r>
-          </w:p>
-        </w:tc>
-      </w:tr>
-      <w:tr>
-        <w:trPr>
-          <w:cantSplit/>
-          <w:tblHeader w:val="off"/>
-        </w:trPr>
-        <w:tc>
-          <w:tcPr>
-            <w:tcW w:type="dxa" w:w="2500"/>
-            <w:tcBorders>
-              <w:top w:val="none" w:color="FFFFFF" w:sz="0"/>
-              <w:left w:val="none" w:color="FFFFFF" w:sz="0"/>
-              <w:bottom w:val="none" w:color="FFFFFF" w:sz="0"/>
-              <w:right w:val="none" w:color="FFFFFF" w:sz="0"/>
-            </w:tcBorders>
-            <w:shd w:fill="FFFFFF" w:color="auto" w:val="clear"/>
-            <w:tcMar>
-              <w:top w:type="dxa" w:w="40"/>
-              <w:left w:type="dxa" w:w="80"/>
-              <w:bottom w:type="dxa" w:w="40"/>
-              <w:right w:type="dxa" w:w="80"/>
-            </w:tcMar>
-          </w:tcPr>
-          <w:p>
-            <w:pPr>
-              <w:spacing w:after="0" w:before="0" w:line="240"/>
-              <w:jc w:val="left"/>
-            </w:pPr>
-            <w:r>
-              <w:rPr>
-                <w:rFonts w:ascii="Times New Roman" w:cs="Times New Roman" w:eastAsia="Times New Roman" w:hAnsi="Times New Roman"/>
-                <w:sz w:val="20"/>
-                <w:szCs w:val="20"/>
-              </w:rPr>
-              <w:t xml:space="preserve">Target not in the facts line</w:t>
-            </w:r>
-          </w:p>
-        </w:tc>
-        <w:tc>
-          <w:tcPr>
-            <w:tcW w:type="dxa" w:w="1200"/>
-            <w:tcBorders>
-              <w:top w:val="none" w:color="FFFFFF" w:sz="0"/>
-              <w:left w:val="none" w:color="FFFFFF" w:sz="0"/>
-              <w:bottom w:val="none" w:color="FFFFFF" w:sz="0"/>
-              <w:right w:val="none" w:color="FFFFFF" w:sz="0"/>
-            </w:tcBorders>
-            <w:shd w:fill="FFFFFF" w:color="auto" w:val="clear"/>
-            <w:tcMar>
-              <w:top w:type="dxa" w:w="40"/>
-              <w:left w:type="dxa" w:w="80"/>
-              <w:bottom w:type="dxa" w:w="40"/>
-              <w:right w:type="dxa" w:w="80"/>
-            </w:tcMar>
-          </w:tcPr>
-          <w:p>
-            <w:pPr>
-              <w:spacing w:after="0" w:before="0" w:line="240"/>
-              <w:jc w:val="center"/>
-            </w:pPr>
-            <w:r>
-              <w:rPr>
-                <w:rFonts w:ascii="Times New Roman" w:cs="Times New Roman" w:eastAsia="Times New Roman" w:hAnsi="Times New Roman"/>
-                <w:sz w:val="20"/>
-                <w:szCs w:val="20"/>
-              </w:rPr>
-              <w:t xml:space="preserve">0.2%</w:t>
-            </w:r>
-          </w:p>
-        </w:tc>
-        <w:tc>
-          <w:tcPr>
-            <w:tcW w:type="dxa" w:w="1200"/>
-            <w:tcBorders>
-              <w:top w:val="none" w:color="FFFFFF" w:sz="0"/>
-              <w:left w:val="none" w:color="FFFFFF" w:sz="0"/>
-              <w:bottom w:val="none" w:color="FFFFFF" w:sz="0"/>
-              <w:right w:val="none" w:color="FFFFFF" w:sz="0"/>
-            </w:tcBorders>
-            <w:shd w:fill="FFFFFF" w:color="auto" w:val="clear"/>
-            <w:tcMar>
-              <w:top w:type="dxa" w:w="40"/>
-              <w:left w:type="dxa" w:w="80"/>
-              <w:bottom w:type="dxa" w:w="40"/>
-              <w:right w:type="dxa" w:w="80"/>
-            </w:tcMar>
-          </w:tcPr>
-          <w:p>
-            <w:pPr>
-              <w:spacing w:after="0" w:before="0" w:line="240"/>
-              <w:jc w:val="center"/>
-            </w:pPr>
-            <w:r>
-              <w:rPr>
-                <w:rFonts w:ascii="Times New Roman" w:cs="Times New Roman" w:eastAsia="Times New Roman" w:hAnsi="Times New Roman"/>
-                <w:sz w:val="20"/>
-                <w:szCs w:val="20"/>
-              </w:rPr>
-              <w:t xml:space="preserve">0.2%</w:t>
-            </w:r>
-          </w:p>
-        </w:tc>
-        <w:tc>
-          <w:tcPr>
-            <w:tcW w:type="dxa" w:w="1300"/>
-            <w:tcBorders>
-              <w:top w:val="none" w:color="FFFFFF" w:sz="0"/>
-              <w:left w:val="none" w:color="FFFFFF" w:sz="0"/>
-              <w:bottom w:val="none" w:color="FFFFFF" w:sz="0"/>
-              <w:right w:val="none" w:color="FFFFFF" w:sz="0"/>
-            </w:tcBorders>
-            <w:shd w:fill="FFFFFF" w:color="auto" w:val="clear"/>
-            <w:tcMar>
-              <w:top w:type="dxa" w:w="40"/>
-              <w:left w:type="dxa" w:w="80"/>
-              <w:bottom w:type="dxa" w:w="40"/>
-              <w:right w:type="dxa" w:w="80"/>
-            </w:tcMar>
-          </w:tcPr>
-          <w:p>
-            <w:pPr>
-              <w:spacing w:after="0" w:before="0" w:line="240"/>
-              <w:jc w:val="center"/>
-            </w:pPr>
-            <w:r>
-              <w:rPr>
-                <w:rFonts w:ascii="Times New Roman" w:cs="Times New Roman" w:eastAsia="Times New Roman" w:hAnsi="Times New Roman"/>
-                <w:sz w:val="20"/>
-                <w:szCs w:val="20"/>
-              </w:rPr>
-              <w:t xml:space="preserve">21.0%</w:t>
-            </w:r>
-          </w:p>
-        </w:tc>
-        <w:tc>
-          <w:tcPr>
-            <w:tcW w:type="dxa" w:w="1700"/>
-            <w:tcBorders>
-              <w:top w:val="none" w:color="FFFFFF" w:sz="0"/>
-              <w:left w:val="none" w:color="FFFFFF" w:sz="0"/>
-              <w:bottom w:val="none" w:color="FFFFFF" w:sz="0"/>
-              <w:right w:val="none" w:color="FFFFFF" w:sz="0"/>
-            </w:tcBorders>
-            <w:shd w:fill="FFFFFF" w:color="auto" w:val="clear"/>
-            <w:tcMar>
-              <w:top w:type="dxa" w:w="40"/>
-              <w:left w:type="dxa" w:w="80"/>
-              <w:bottom w:type="dxa" w:w="40"/>
-              <w:right w:type="dxa" w:w="80"/>
-            </w:tcMar>
-          </w:tcPr>
-          <w:p>
-            <w:pPr>
-              <w:spacing w:after="0" w:before="0" w:line="240"/>
-              <w:jc w:val="center"/>
-            </w:pPr>
-            <w:r>
-              <w:rPr>
-                <w:rFonts w:ascii="Times New Roman" w:cs="Times New Roman" w:eastAsia="Times New Roman" w:hAnsi="Times New Roman"/>
-                <w:sz w:val="20"/>
-                <w:szCs w:val="20"/>
-              </w:rPr>
-              <w:t xml:space="preserve">7.1%</w:t>
-            </w:r>
-          </w:p>
-        </w:tc>
-        <w:tc>
-          <w:tcPr>
-            <w:tcW w:type="dxa" w:w="1460"/>
-            <w:tcBorders>
-              <w:top w:val="none" w:color="FFFFFF" w:sz="0"/>
-              <w:left w:val="none" w:color="FFFFFF" w:sz="0"/>
-              <w:bottom w:val="none" w:color="FFFFFF" w:sz="0"/>
-              <w:right w:val="none" w:color="FFFFFF" w:sz="0"/>
-            </w:tcBorders>
-            <w:shd w:fill="FFFFFF" w:color="auto" w:val="clear"/>
-            <w:tcMar>
-              <w:top w:type="dxa" w:w="40"/>
-              <w:left w:type="dxa" w:w="80"/>
-              <w:bottom w:type="dxa" w:w="40"/>
-              <w:right w:type="dxa" w:w="80"/>
-            </w:tcMar>
-          </w:tcPr>
-          <w:p>
-            <w:pPr>
-              <w:spacing w:after="0" w:before="0" w:line="240"/>
-              <w:jc w:val="center"/>
-            </w:pPr>
-            <w:r>
-              <w:rPr>
-                <w:rFonts w:ascii="Times New Roman" w:cs="Times New Roman" w:eastAsia="Times New Roman" w:hAnsi="Times New Roman"/>
-                <w:sz w:val="20"/>
-                <w:szCs w:val="20"/>
-              </w:rPr>
-              <w:t xml:space="preserve">6.2%</w:t>
-            </w:r>
-          </w:p>
-        </w:tc>
-      </w:tr>
-    </w:tbl>
-    <w:p>
-      <w:pPr>
-        <w:spacing w:after="240" w:before="60" w:line="240"/>
-      </w:pPr>
-      <w:r>
-        <w:rPr>
-          <w:rFonts w:ascii="Times New Roman" w:cs="Times New Roman" w:eastAsia="Times New Roman" w:hAnsi="Times New Roman"/>
-          <w:i/>
-          <w:iCs/>
-          <w:sz w:val="20"/>
-          <w:szCs w:val="20"/>
-        </w:rPr>
-        <w:t xml:space="preserve">Note.</w:t>
-      </w:r>
-      <w:r>
-        <w:rPr>
-          <w:rFonts w:ascii="Times New Roman" w:cs="Times New Roman" w:eastAsia="Times New Roman" w:hAnsi="Times New Roman"/>
-          <w:sz w:val="20"/>
-          <w:szCs w:val="20"/>
-        </w:rPr>
-        <w:t xml:space="preserve"> The gain frame and the two target frames state the target in the headline.</w:t>
+        <w:t xml:space="preserve">11. Discussion</w:t>
       </w:r>
     </w:p>
     <w:p>
       <w:pPr>
+        <w:pStyle w:val="Heading2"/>
         <w:keepNext/>
         <w:spacing w:after="0" w:before="0" w:line="480"/>
       </w:pPr>
@@ -16516,881 +14998,12 @@
           <w:rFonts w:ascii="Times New Roman" w:cs="Times New Roman" w:eastAsia="Times New Roman" w:hAnsi="Times New Roman"/>
           <w:b/>
           <w:bCs/>
-          <w:sz w:val="24"/>
-          <w:szCs w:val="24"/>
-        </w:rPr>
-        <w:t xml:space="preserve">Table 13.</w:t>
-      </w:r>
-      <w:r>
-        <w:rPr>
-          <w:rFonts w:ascii="Times New Roman" w:cs="Times New Roman" w:eastAsia="Times New Roman" w:hAnsi="Times New Roman"/>
-          <w:sz w:val="24"/>
-          <w:szCs w:val="24"/>
-        </w:rPr>
-        <w:t xml:space="preserve"> Study 6: Gemini 2.5 Flash-Lite, contrasts in percentage points with 95% intervals over wordings.</w:t>
-      </w:r>
-    </w:p>
-    <w:tbl>
-      <w:tblPr>
-        <w:tblW w:type="dxa" w:w="9360"/>
-        <w:tblBorders>
-          <w:top w:val="single" w:color="auto" w:sz="4"/>
-          <w:left w:val="single" w:color="auto" w:sz="4"/>
-          <w:bottom w:val="single" w:color="auto" w:sz="4"/>
-          <w:right w:val="single" w:color="auto" w:sz="4"/>
-          <w:insideH w:val="single" w:color="auto" w:sz="4"/>
-          <w:insideV w:val="single" w:color="auto" w:sz="4"/>
-        </w:tblBorders>
-      </w:tblPr>
-      <w:tblGrid>
-        <w:gridCol w:w="4300"/>
-        <w:gridCol w:w="2530"/>
-        <w:gridCol w:w="2530"/>
-      </w:tblGrid>
-      <w:tr>
-        <w:trPr>
-          <w:cantSplit/>
-          <w:tblHeader/>
-        </w:trPr>
-        <w:tc>
-          <w:tcPr>
-            <w:tcW w:type="dxa" w:w="4300"/>
-            <w:tcBorders>
-              <w:top w:val="single" w:color="000000" w:sz="4"/>
-              <w:left w:val="none" w:color="FFFFFF" w:sz="0"/>
-              <w:bottom w:val="single" w:color="000000" w:sz="4"/>
-              <w:right w:val="none" w:color="FFFFFF" w:sz="0"/>
-            </w:tcBorders>
-            <w:shd w:fill="FFFFFF" w:color="auto" w:val="clear"/>
-            <w:tcMar>
-              <w:top w:type="dxa" w:w="40"/>
-              <w:left w:type="dxa" w:w="80"/>
-              <w:bottom w:type="dxa" w:w="40"/>
-              <w:right w:type="dxa" w:w="80"/>
-            </w:tcMar>
-          </w:tcPr>
-          <w:p>
-            <w:pPr>
-              <w:spacing w:after="0" w:before="0" w:line="240"/>
-              <w:jc w:val="left"/>
-            </w:pPr>
-            <w:r>
-              <w:rPr>
-                <w:rFonts w:ascii="Times New Roman" w:cs="Times New Roman" w:eastAsia="Times New Roman" w:hAnsi="Times New Roman"/>
-                <w:b/>
-                <w:bCs/>
-                <w:sz w:val="20"/>
-                <w:szCs w:val="20"/>
-              </w:rPr>
-              <w:t xml:space="preserve">Contrast</w:t>
-            </w:r>
-          </w:p>
-        </w:tc>
-        <w:tc>
-          <w:tcPr>
-            <w:tcW w:type="dxa" w:w="2530"/>
-            <w:tcBorders>
-              <w:top w:val="single" w:color="000000" w:sz="4"/>
-              <w:left w:val="none" w:color="FFFFFF" w:sz="0"/>
-              <w:bottom w:val="single" w:color="000000" w:sz="4"/>
-              <w:right w:val="none" w:color="FFFFFF" w:sz="0"/>
-            </w:tcBorders>
-            <w:shd w:fill="FFFFFF" w:color="auto" w:val="clear"/>
-            <w:tcMar>
-              <w:top w:type="dxa" w:w="40"/>
-              <w:left w:type="dxa" w:w="80"/>
-              <w:bottom w:type="dxa" w:w="40"/>
-              <w:right w:type="dxa" w:w="80"/>
-            </w:tcMar>
-          </w:tcPr>
-          <w:p>
-            <w:pPr>
-              <w:spacing w:after="0" w:before="0" w:line="240"/>
-              <w:jc w:val="center"/>
-            </w:pPr>
-            <w:r>
-              <w:rPr>
-                <w:rFonts w:ascii="Times New Roman" w:cs="Times New Roman" w:eastAsia="Times New Roman" w:hAnsi="Times New Roman"/>
-                <w:b/>
-                <w:bCs/>
-                <w:sz w:val="20"/>
-                <w:szCs w:val="20"/>
-              </w:rPr>
-              <w:t xml:space="preserve">Target in the facts line</w:t>
-            </w:r>
-          </w:p>
-        </w:tc>
-        <w:tc>
-          <w:tcPr>
-            <w:tcW w:type="dxa" w:w="2530"/>
-            <w:tcBorders>
-              <w:top w:val="single" w:color="000000" w:sz="4"/>
-              <w:left w:val="none" w:color="FFFFFF" w:sz="0"/>
-              <w:bottom w:val="single" w:color="000000" w:sz="4"/>
-              <w:right w:val="none" w:color="FFFFFF" w:sz="0"/>
-            </w:tcBorders>
-            <w:shd w:fill="FFFFFF" w:color="auto" w:val="clear"/>
-            <w:tcMar>
-              <w:top w:type="dxa" w:w="40"/>
-              <w:left w:type="dxa" w:w="80"/>
-              <w:bottom w:type="dxa" w:w="40"/>
-              <w:right w:type="dxa" w:w="80"/>
-            </w:tcMar>
-          </w:tcPr>
-          <w:p>
-            <w:pPr>
-              <w:spacing w:after="0" w:before="0" w:line="240"/>
-              <w:jc w:val="center"/>
-            </w:pPr>
-            <w:r>
-              <w:rPr>
-                <w:rFonts w:ascii="Times New Roman" w:cs="Times New Roman" w:eastAsia="Times New Roman" w:hAnsi="Times New Roman"/>
-                <w:b/>
-                <w:bCs/>
-                <w:sz w:val="20"/>
-                <w:szCs w:val="20"/>
-              </w:rPr>
-              <w:t xml:space="preserve">Target not in the facts line</w:t>
-            </w:r>
-          </w:p>
-        </w:tc>
-      </w:tr>
-      <w:tr>
-        <w:trPr>
-          <w:cantSplit/>
-          <w:tblHeader w:val="off"/>
-        </w:trPr>
-        <w:tc>
-          <w:tcPr>
-            <w:tcW w:type="dxa" w:w="4300"/>
-            <w:tcBorders>
-              <w:top w:val="none" w:color="FFFFFF" w:sz="0"/>
-              <w:left w:val="none" w:color="FFFFFF" w:sz="0"/>
-              <w:bottom w:val="none" w:color="FFFFFF" w:sz="0"/>
-              <w:right w:val="none" w:color="FFFFFF" w:sz="0"/>
-            </w:tcBorders>
-            <w:shd w:fill="FFFFFF" w:color="auto" w:val="clear"/>
-            <w:tcMar>
-              <w:top w:type="dxa" w:w="40"/>
-              <w:left w:type="dxa" w:w="80"/>
-              <w:bottom w:type="dxa" w:w="40"/>
-              <w:right w:type="dxa" w:w="80"/>
-            </w:tcMar>
-          </w:tcPr>
-          <w:p>
-            <w:pPr>
-              <w:spacing w:after="0" w:before="0" w:line="240"/>
-              <w:jc w:val="left"/>
-            </w:pPr>
-            <w:r>
-              <w:rPr>
-                <w:rFonts w:ascii="Times New Roman" w:cs="Times New Roman" w:eastAsia="Times New Roman" w:hAnsi="Times New Roman"/>
-                <w:sz w:val="20"/>
-                <w:szCs w:val="20"/>
-              </w:rPr>
-              <w:t xml:space="preserve">Goal effect, neutral wording (neutral + target minus neutral)</w:t>
-            </w:r>
-          </w:p>
-        </w:tc>
-        <w:tc>
-          <w:tcPr>
-            <w:tcW w:type="dxa" w:w="2530"/>
-            <w:tcBorders>
-              <w:top w:val="none" w:color="FFFFFF" w:sz="0"/>
-              <w:left w:val="none" w:color="FFFFFF" w:sz="0"/>
-              <w:bottom w:val="none" w:color="FFFFFF" w:sz="0"/>
-              <w:right w:val="none" w:color="FFFFFF" w:sz="0"/>
-            </w:tcBorders>
-            <w:shd w:fill="FFFFFF" w:color="auto" w:val="clear"/>
-            <w:tcMar>
-              <w:top w:type="dxa" w:w="40"/>
-              <w:left w:type="dxa" w:w="80"/>
-              <w:bottom w:type="dxa" w:w="40"/>
-              <w:right w:type="dxa" w:w="80"/>
-            </w:tcMar>
-          </w:tcPr>
-          <w:p>
-            <w:pPr>
-              <w:spacing w:after="0" w:before="0" w:line="240"/>
-              <w:jc w:val="center"/>
-            </w:pPr>
-            <w:r>
-              <w:rPr>
-                <w:rFonts w:ascii="Times New Roman" w:cs="Times New Roman" w:eastAsia="Times New Roman" w:hAnsi="Times New Roman"/>
-                <w:sz w:val="20"/>
-                <w:szCs w:val="20"/>
-              </w:rPr>
-              <w:t xml:space="preserve">+0.4 [-10.2, +11.9]</w:t>
-            </w:r>
-          </w:p>
-        </w:tc>
-        <w:tc>
-          <w:tcPr>
-            <w:tcW w:type="dxa" w:w="2530"/>
-            <w:tcBorders>
-              <w:top w:val="none" w:color="FFFFFF" w:sz="0"/>
-              <w:left w:val="none" w:color="FFFFFF" w:sz="0"/>
-              <w:bottom w:val="none" w:color="FFFFFF" w:sz="0"/>
-              <w:right w:val="none" w:color="FFFFFF" w:sz="0"/>
-            </w:tcBorders>
-            <w:shd w:fill="FFFFFF" w:color="auto" w:val="clear"/>
-            <w:tcMar>
-              <w:top w:type="dxa" w:w="40"/>
-              <w:left w:type="dxa" w:w="80"/>
-              <w:bottom w:type="dxa" w:w="40"/>
-              <w:right w:type="dxa" w:w="80"/>
-            </w:tcMar>
-          </w:tcPr>
-          <w:p>
-            <w:pPr>
-              <w:spacing w:after="0" w:before="0" w:line="240"/>
-              <w:jc w:val="center"/>
-            </w:pPr>
-            <w:r>
-              <w:rPr>
-                <w:rFonts w:ascii="Times New Roman" w:cs="Times New Roman" w:eastAsia="Times New Roman" w:hAnsi="Times New Roman"/>
-                <w:sz w:val="20"/>
-                <w:szCs w:val="20"/>
-              </w:rPr>
-              <w:t xml:space="preserve">+6.9 [+0.2, +18.1]</w:t>
-            </w:r>
-          </w:p>
-        </w:tc>
-      </w:tr>
-      <w:tr>
-        <w:trPr>
-          <w:cantSplit/>
-          <w:tblHeader w:val="off"/>
-        </w:trPr>
-        <w:tc>
-          <w:tcPr>
-            <w:tcW w:type="dxa" w:w="4300"/>
-            <w:tcBorders>
-              <w:top w:val="none" w:color="FFFFFF" w:sz="0"/>
-              <w:left w:val="none" w:color="FFFFFF" w:sz="0"/>
-              <w:bottom w:val="none" w:color="FFFFFF" w:sz="0"/>
-              <w:right w:val="none" w:color="FFFFFF" w:sz="0"/>
-            </w:tcBorders>
-            <w:shd w:fill="FFFFFF" w:color="auto" w:val="clear"/>
-            <w:tcMar>
-              <w:top w:type="dxa" w:w="40"/>
-              <w:left w:type="dxa" w:w="80"/>
-              <w:bottom w:type="dxa" w:w="40"/>
-              <w:right w:type="dxa" w:w="80"/>
-            </w:tcMar>
-          </w:tcPr>
-          <w:p>
-            <w:pPr>
-              <w:spacing w:after="0" w:before="0" w:line="240"/>
-              <w:jc w:val="left"/>
-            </w:pPr>
-            <w:r>
-              <w:rPr>
-                <w:rFonts w:ascii="Times New Roman" w:cs="Times New Roman" w:eastAsia="Times New Roman" w:hAnsi="Times New Roman"/>
-                <w:sz w:val="20"/>
-                <w:szCs w:val="20"/>
-              </w:rPr>
-              <w:t xml:space="preserve">Goal effect, loss wording (loss + target minus loss)</w:t>
-            </w:r>
-          </w:p>
-        </w:tc>
-        <w:tc>
-          <w:tcPr>
-            <w:tcW w:type="dxa" w:w="2530"/>
-            <w:tcBorders>
-              <w:top w:val="none" w:color="FFFFFF" w:sz="0"/>
-              <w:left w:val="none" w:color="FFFFFF" w:sz="0"/>
-              <w:bottom w:val="none" w:color="FFFFFF" w:sz="0"/>
-              <w:right w:val="none" w:color="FFFFFF" w:sz="0"/>
-            </w:tcBorders>
-            <w:shd w:fill="FFFFFF" w:color="auto" w:val="clear"/>
-            <w:tcMar>
-              <w:top w:type="dxa" w:w="40"/>
-              <w:left w:type="dxa" w:w="80"/>
-              <w:bottom w:type="dxa" w:w="40"/>
-              <w:right w:type="dxa" w:w="80"/>
-            </w:tcMar>
-          </w:tcPr>
-          <w:p>
-            <w:pPr>
-              <w:spacing w:after="0" w:before="0" w:line="240"/>
-              <w:jc w:val="center"/>
-            </w:pPr>
-            <w:r>
-              <w:rPr>
-                <w:rFonts w:ascii="Times New Roman" w:cs="Times New Roman" w:eastAsia="Times New Roman" w:hAnsi="Times New Roman"/>
-                <w:sz w:val="20"/>
-                <w:szCs w:val="20"/>
-              </w:rPr>
-              <w:t xml:space="preserve">+9.6 [+1.0, +21.3]</w:t>
-            </w:r>
-          </w:p>
-        </w:tc>
-        <w:tc>
-          <w:tcPr>
-            <w:tcW w:type="dxa" w:w="2530"/>
-            <w:tcBorders>
-              <w:top w:val="none" w:color="FFFFFF" w:sz="0"/>
-              <w:left w:val="none" w:color="FFFFFF" w:sz="0"/>
-              <w:bottom w:val="none" w:color="FFFFFF" w:sz="0"/>
-              <w:right w:val="none" w:color="FFFFFF" w:sz="0"/>
-            </w:tcBorders>
-            <w:shd w:fill="FFFFFF" w:color="auto" w:val="clear"/>
-            <w:tcMar>
-              <w:top w:type="dxa" w:w="40"/>
-              <w:left w:type="dxa" w:w="80"/>
-              <w:bottom w:type="dxa" w:w="40"/>
-              <w:right w:type="dxa" w:w="80"/>
-            </w:tcMar>
-          </w:tcPr>
-          <w:p>
-            <w:pPr>
-              <w:spacing w:after="0" w:before="0" w:line="240"/>
-              <w:jc w:val="center"/>
-            </w:pPr>
-            <w:r>
-              <w:rPr>
-                <w:rFonts w:ascii="Times New Roman" w:cs="Times New Roman" w:eastAsia="Times New Roman" w:hAnsi="Times New Roman"/>
-                <w:sz w:val="20"/>
-                <w:szCs w:val="20"/>
-              </w:rPr>
-              <w:t xml:space="preserve">+6.0 [+1.5, +12.7]</w:t>
-            </w:r>
-          </w:p>
-        </w:tc>
-      </w:tr>
-      <w:tr>
-        <w:trPr>
-          <w:cantSplit/>
-          <w:tblHeader w:val="off"/>
-        </w:trPr>
-        <w:tc>
-          <w:tcPr>
-            <w:tcW w:type="dxa" w:w="4300"/>
-            <w:tcBorders>
-              <w:top w:val="none" w:color="FFFFFF" w:sz="0"/>
-              <w:left w:val="none" w:color="FFFFFF" w:sz="0"/>
-              <w:bottom w:val="none" w:color="FFFFFF" w:sz="0"/>
-              <w:right w:val="none" w:color="FFFFFF" w:sz="0"/>
-            </w:tcBorders>
-            <w:shd w:fill="FFFFFF" w:color="auto" w:val="clear"/>
-            <w:tcMar>
-              <w:top w:type="dxa" w:w="40"/>
-              <w:left w:type="dxa" w:w="80"/>
-              <w:bottom w:type="dxa" w:w="40"/>
-              <w:right w:type="dxa" w:w="80"/>
-            </w:tcMar>
-          </w:tcPr>
-          <w:p>
-            <w:pPr>
-              <w:spacing w:after="0" w:before="0" w:line="240"/>
-              <w:jc w:val="left"/>
-            </w:pPr>
-            <w:r>
-              <w:rPr>
-                <w:rFonts w:ascii="Times New Roman" w:cs="Times New Roman" w:eastAsia="Times New Roman" w:hAnsi="Times New Roman"/>
-                <w:sz w:val="20"/>
-                <w:szCs w:val="20"/>
-              </w:rPr>
-              <w:t xml:space="preserve">Valence without target (loss minus neutral)</w:t>
-            </w:r>
-          </w:p>
-        </w:tc>
-        <w:tc>
-          <w:tcPr>
-            <w:tcW w:type="dxa" w:w="2530"/>
-            <w:tcBorders>
-              <w:top w:val="none" w:color="FFFFFF" w:sz="0"/>
-              <w:left w:val="none" w:color="FFFFFF" w:sz="0"/>
-              <w:bottom w:val="none" w:color="FFFFFF" w:sz="0"/>
-              <w:right w:val="none" w:color="FFFFFF" w:sz="0"/>
-            </w:tcBorders>
-            <w:shd w:fill="FFFFFF" w:color="auto" w:val="clear"/>
-            <w:tcMar>
-              <w:top w:type="dxa" w:w="40"/>
-              <w:left w:type="dxa" w:w="80"/>
-              <w:bottom w:type="dxa" w:w="40"/>
-              <w:right w:type="dxa" w:w="80"/>
-            </w:tcMar>
-          </w:tcPr>
-          <w:p>
-            <w:pPr>
-              <w:spacing w:after="0" w:before="0" w:line="240"/>
-              <w:jc w:val="center"/>
-            </w:pPr>
-            <w:r>
-              <w:rPr>
-                <w:rFonts w:ascii="Times New Roman" w:cs="Times New Roman" w:eastAsia="Times New Roman" w:hAnsi="Times New Roman"/>
-                <w:sz w:val="20"/>
-                <w:szCs w:val="20"/>
-              </w:rPr>
-              <w:t xml:space="preserve">-15.4 [-29.4, -4.0]</w:t>
-            </w:r>
-          </w:p>
-        </w:tc>
-        <w:tc>
-          <w:tcPr>
-            <w:tcW w:type="dxa" w:w="2530"/>
-            <w:tcBorders>
-              <w:top w:val="none" w:color="FFFFFF" w:sz="0"/>
-              <w:left w:val="none" w:color="FFFFFF" w:sz="0"/>
-              <w:bottom w:val="none" w:color="FFFFFF" w:sz="0"/>
-              <w:right w:val="none" w:color="FFFFFF" w:sz="0"/>
-            </w:tcBorders>
-            <w:shd w:fill="FFFFFF" w:color="auto" w:val="clear"/>
-            <w:tcMar>
-              <w:top w:type="dxa" w:w="40"/>
-              <w:left w:type="dxa" w:w="80"/>
-              <w:bottom w:type="dxa" w:w="40"/>
-              <w:right w:type="dxa" w:w="80"/>
-            </w:tcMar>
-          </w:tcPr>
-          <w:p>
-            <w:pPr>
-              <w:spacing w:after="0" w:before="0" w:line="240"/>
-              <w:jc w:val="center"/>
-            </w:pPr>
-            <w:r>
-              <w:rPr>
-                <w:rFonts w:ascii="Times New Roman" w:cs="Times New Roman" w:eastAsia="Times New Roman" w:hAnsi="Times New Roman"/>
-                <w:sz w:val="20"/>
-                <w:szCs w:val="20"/>
-              </w:rPr>
-              <w:t xml:space="preserve">+0.0 [-0.6, +0.6]</w:t>
-            </w:r>
-          </w:p>
-        </w:tc>
-      </w:tr>
-      <w:tr>
-        <w:trPr>
-          <w:cantSplit/>
-          <w:tblHeader w:val="off"/>
-        </w:trPr>
-        <w:tc>
-          <w:tcPr>
-            <w:tcW w:type="dxa" w:w="4300"/>
-            <w:tcBorders>
-              <w:top w:val="none" w:color="FFFFFF" w:sz="0"/>
-              <w:left w:val="none" w:color="FFFFFF" w:sz="0"/>
-              <w:bottom w:val="none" w:color="FFFFFF" w:sz="0"/>
-              <w:right w:val="none" w:color="FFFFFF" w:sz="0"/>
-            </w:tcBorders>
-            <w:shd w:fill="FFFFFF" w:color="auto" w:val="clear"/>
-            <w:tcMar>
-              <w:top w:type="dxa" w:w="40"/>
-              <w:left w:type="dxa" w:w="80"/>
-              <w:bottom w:type="dxa" w:w="40"/>
-              <w:right w:type="dxa" w:w="80"/>
-            </w:tcMar>
-          </w:tcPr>
-          <w:p>
-            <w:pPr>
-              <w:spacing w:after="0" w:before="0" w:line="240"/>
-              <w:jc w:val="left"/>
-            </w:pPr>
-            <w:r>
-              <w:rPr>
-                <w:rFonts w:ascii="Times New Roman" w:cs="Times New Roman" w:eastAsia="Times New Roman" w:hAnsi="Times New Roman"/>
-                <w:sz w:val="20"/>
-                <w:szCs w:val="20"/>
-              </w:rPr>
-              <w:t xml:space="preserve">Valence with target (loss + target minus neutral + target)</w:t>
-            </w:r>
-          </w:p>
-        </w:tc>
-        <w:tc>
-          <w:tcPr>
-            <w:tcW w:type="dxa" w:w="2530"/>
-            <w:tcBorders>
-              <w:top w:val="none" w:color="FFFFFF" w:sz="0"/>
-              <w:left w:val="none" w:color="FFFFFF" w:sz="0"/>
-              <w:bottom w:val="none" w:color="FFFFFF" w:sz="0"/>
-              <w:right w:val="none" w:color="FFFFFF" w:sz="0"/>
-            </w:tcBorders>
-            <w:shd w:fill="FFFFFF" w:color="auto" w:val="clear"/>
-            <w:tcMar>
-              <w:top w:type="dxa" w:w="40"/>
-              <w:left w:type="dxa" w:w="80"/>
-              <w:bottom w:type="dxa" w:w="40"/>
-              <w:right w:type="dxa" w:w="80"/>
-            </w:tcMar>
-          </w:tcPr>
-          <w:p>
-            <w:pPr>
-              <w:spacing w:after="0" w:before="0" w:line="240"/>
-              <w:jc w:val="center"/>
-            </w:pPr>
-            <w:r>
-              <w:rPr>
-                <w:rFonts w:ascii="Times New Roman" w:cs="Times New Roman" w:eastAsia="Times New Roman" w:hAnsi="Times New Roman"/>
-                <w:sz w:val="20"/>
-                <w:szCs w:val="20"/>
-              </w:rPr>
-              <w:t xml:space="preserve">-6.2 [-17.3, +5.4]</w:t>
-            </w:r>
-          </w:p>
-        </w:tc>
-        <w:tc>
-          <w:tcPr>
-            <w:tcW w:type="dxa" w:w="2530"/>
-            <w:tcBorders>
-              <w:top w:val="none" w:color="FFFFFF" w:sz="0"/>
-              <w:left w:val="none" w:color="FFFFFF" w:sz="0"/>
-              <w:bottom w:val="none" w:color="FFFFFF" w:sz="0"/>
-              <w:right w:val="none" w:color="FFFFFF" w:sz="0"/>
-            </w:tcBorders>
-            <w:shd w:fill="FFFFFF" w:color="auto" w:val="clear"/>
-            <w:tcMar>
-              <w:top w:type="dxa" w:w="40"/>
-              <w:left w:type="dxa" w:w="80"/>
-              <w:bottom w:type="dxa" w:w="40"/>
-              <w:right w:type="dxa" w:w="80"/>
-            </w:tcMar>
-          </w:tcPr>
-          <w:p>
-            <w:pPr>
-              <w:spacing w:after="0" w:before="0" w:line="240"/>
-              <w:jc w:val="center"/>
-            </w:pPr>
-            <w:r>
-              <w:rPr>
-                <w:rFonts w:ascii="Times New Roman" w:cs="Times New Roman" w:eastAsia="Times New Roman" w:hAnsi="Times New Roman"/>
-                <w:sz w:val="20"/>
-                <w:szCs w:val="20"/>
-              </w:rPr>
-              <w:t xml:space="preserve">-0.8 [-14.4, +9.8]</w:t>
-            </w:r>
-          </w:p>
-        </w:tc>
-      </w:tr>
-      <w:tr>
-        <w:trPr>
-          <w:cantSplit/>
-          <w:tblHeader w:val="off"/>
-        </w:trPr>
-        <w:tc>
-          <w:tcPr>
-            <w:tcW w:type="dxa" w:w="4300"/>
-            <w:tcBorders>
-              <w:top w:val="none" w:color="FFFFFF" w:sz="0"/>
-              <w:left w:val="none" w:color="FFFFFF" w:sz="0"/>
-              <w:bottom w:val="none" w:color="FFFFFF" w:sz="0"/>
-              <w:right w:val="none" w:color="FFFFFF" w:sz="0"/>
-            </w:tcBorders>
-            <w:shd w:fill="FFFFFF" w:color="auto" w:val="clear"/>
-            <w:tcMar>
-              <w:top w:type="dxa" w:w="40"/>
-              <w:left w:type="dxa" w:w="80"/>
-              <w:bottom w:type="dxa" w:w="40"/>
-              <w:right w:type="dxa" w:w="80"/>
-            </w:tcMar>
-          </w:tcPr>
-          <w:p>
-            <w:pPr>
-              <w:spacing w:after="0" w:before="0" w:line="240"/>
-              <w:jc w:val="left"/>
-            </w:pPr>
-            <w:r>
-              <w:rPr>
-                <w:rFonts w:ascii="Times New Roman" w:cs="Times New Roman" w:eastAsia="Times New Roman" w:hAnsi="Times New Roman"/>
-                <w:sz w:val="20"/>
-                <w:szCs w:val="20"/>
-              </w:rPr>
-              <w:t xml:space="preserve">Interaction (valence with target minus without)</w:t>
-            </w:r>
-          </w:p>
-        </w:tc>
-        <w:tc>
-          <w:tcPr>
-            <w:tcW w:type="dxa" w:w="2530"/>
-            <w:tcBorders>
-              <w:top w:val="none" w:color="FFFFFF" w:sz="0"/>
-              <w:left w:val="none" w:color="FFFFFF" w:sz="0"/>
-              <w:bottom w:val="none" w:color="FFFFFF" w:sz="0"/>
-              <w:right w:val="none" w:color="FFFFFF" w:sz="0"/>
-            </w:tcBorders>
-            <w:shd w:fill="FFFFFF" w:color="auto" w:val="clear"/>
-            <w:tcMar>
-              <w:top w:type="dxa" w:w="40"/>
-              <w:left w:type="dxa" w:w="80"/>
-              <w:bottom w:type="dxa" w:w="40"/>
-              <w:right w:type="dxa" w:w="80"/>
-            </w:tcMar>
-          </w:tcPr>
-          <w:p>
-            <w:pPr>
-              <w:spacing w:after="0" w:before="0" w:line="240"/>
-              <w:jc w:val="center"/>
-            </w:pPr>
-            <w:r>
-              <w:rPr>
-                <w:rFonts w:ascii="Times New Roman" w:cs="Times New Roman" w:eastAsia="Times New Roman" w:hAnsi="Times New Roman"/>
-                <w:sz w:val="20"/>
-                <w:szCs w:val="20"/>
-              </w:rPr>
-              <w:t xml:space="preserve">+9.2 [-4.2, +21.9]</w:t>
-            </w:r>
-          </w:p>
-        </w:tc>
-        <w:tc>
-          <w:tcPr>
-            <w:tcW w:type="dxa" w:w="2530"/>
-            <w:tcBorders>
-              <w:top w:val="none" w:color="FFFFFF" w:sz="0"/>
-              <w:left w:val="none" w:color="FFFFFF" w:sz="0"/>
-              <w:bottom w:val="none" w:color="FFFFFF" w:sz="0"/>
-              <w:right w:val="none" w:color="FFFFFF" w:sz="0"/>
-            </w:tcBorders>
-            <w:shd w:fill="FFFFFF" w:color="auto" w:val="clear"/>
-            <w:tcMar>
-              <w:top w:type="dxa" w:w="40"/>
-              <w:left w:type="dxa" w:w="80"/>
-              <w:bottom w:type="dxa" w:w="40"/>
-              <w:right w:type="dxa" w:w="80"/>
-            </w:tcMar>
-          </w:tcPr>
-          <w:p>
-            <w:pPr>
-              <w:spacing w:after="0" w:before="0" w:line="240"/>
-              <w:jc w:val="center"/>
-            </w:pPr>
-            <w:r>
-              <w:rPr>
-                <w:rFonts w:ascii="Times New Roman" w:cs="Times New Roman" w:eastAsia="Times New Roman" w:hAnsi="Times New Roman"/>
-                <w:sz w:val="20"/>
-                <w:szCs w:val="20"/>
-              </w:rPr>
-              <w:t xml:space="preserve">-0.8 [-14.2, +9.4]</w:t>
-            </w:r>
-          </w:p>
-        </w:tc>
-      </w:tr>
-      <w:tr>
-        <w:trPr>
-          <w:cantSplit/>
-          <w:tblHeader w:val="off"/>
-        </w:trPr>
-        <w:tc>
-          <w:tcPr>
-            <w:tcW w:type="dxa" w:w="4300"/>
-            <w:tcBorders>
-              <w:top w:val="none" w:color="FFFFFF" w:sz="0"/>
-              <w:left w:val="none" w:color="FFFFFF" w:sz="0"/>
-              <w:bottom w:val="none" w:color="FFFFFF" w:sz="0"/>
-              <w:right w:val="none" w:color="FFFFFF" w:sz="0"/>
-            </w:tcBorders>
-            <w:shd w:fill="FFFFFF" w:color="auto" w:val="clear"/>
-            <w:tcMar>
-              <w:top w:type="dxa" w:w="40"/>
-              <w:left w:type="dxa" w:w="80"/>
-              <w:bottom w:type="dxa" w:w="40"/>
-              <w:right w:type="dxa" w:w="80"/>
-            </w:tcMar>
-          </w:tcPr>
-          <w:p>
-            <w:pPr>
-              <w:spacing w:after="0" w:before="0" w:line="240"/>
-              <w:jc w:val="left"/>
-            </w:pPr>
-            <w:r>
-              <w:rPr>
-                <w:rFonts w:ascii="Times New Roman" w:cs="Times New Roman" w:eastAsia="Times New Roman" w:hAnsi="Times New Roman"/>
-                <w:sz w:val="20"/>
-                <w:szCs w:val="20"/>
-              </w:rPr>
-              <w:t xml:space="preserve">Registered contrast (loss minus gain)</w:t>
-            </w:r>
-          </w:p>
-        </w:tc>
-        <w:tc>
-          <w:tcPr>
-            <w:tcW w:type="dxa" w:w="2530"/>
-            <w:tcBorders>
-              <w:top w:val="none" w:color="FFFFFF" w:sz="0"/>
-              <w:left w:val="none" w:color="FFFFFF" w:sz="0"/>
-              <w:bottom w:val="none" w:color="FFFFFF" w:sz="0"/>
-              <w:right w:val="none" w:color="FFFFFF" w:sz="0"/>
-            </w:tcBorders>
-            <w:shd w:fill="FFFFFF" w:color="auto" w:val="clear"/>
-            <w:tcMar>
-              <w:top w:type="dxa" w:w="40"/>
-              <w:left w:type="dxa" w:w="80"/>
-              <w:bottom w:type="dxa" w:w="40"/>
-              <w:right w:type="dxa" w:w="80"/>
-            </w:tcMar>
-          </w:tcPr>
-          <w:p>
-            <w:pPr>
-              <w:spacing w:after="0" w:before="0" w:line="240"/>
-              <w:jc w:val="center"/>
-            </w:pPr>
-            <w:r>
-              <w:rPr>
-                <w:rFonts w:ascii="Times New Roman" w:cs="Times New Roman" w:eastAsia="Times New Roman" w:hAnsi="Times New Roman"/>
-                <w:sz w:val="20"/>
-                <w:szCs w:val="20"/>
-              </w:rPr>
-              <w:t xml:space="preserve">-29.2 [-44.2, -14.6]</w:t>
-            </w:r>
-          </w:p>
-        </w:tc>
-        <w:tc>
-          <w:tcPr>
-            <w:tcW w:type="dxa" w:w="2530"/>
-            <w:tcBorders>
-              <w:top w:val="none" w:color="FFFFFF" w:sz="0"/>
-              <w:left w:val="none" w:color="FFFFFF" w:sz="0"/>
-              <w:bottom w:val="none" w:color="FFFFFF" w:sz="0"/>
-              <w:right w:val="none" w:color="FFFFFF" w:sz="0"/>
-            </w:tcBorders>
-            <w:shd w:fill="FFFFFF" w:color="auto" w:val="clear"/>
-            <w:tcMar>
-              <w:top w:type="dxa" w:w="40"/>
-              <w:left w:type="dxa" w:w="80"/>
-              <w:bottom w:type="dxa" w:w="40"/>
-              <w:right w:type="dxa" w:w="80"/>
-            </w:tcMar>
-          </w:tcPr>
-          <w:p>
-            <w:pPr>
-              <w:spacing w:after="0" w:before="0" w:line="240"/>
-              <w:jc w:val="center"/>
-            </w:pPr>
-            <w:r>
-              <w:rPr>
-                <w:rFonts w:ascii="Times New Roman" w:cs="Times New Roman" w:eastAsia="Times New Roman" w:hAnsi="Times New Roman"/>
-                <w:sz w:val="20"/>
-                <w:szCs w:val="20"/>
-              </w:rPr>
-              <w:t xml:space="preserve">-20.8 [-35.4, -8.3]</w:t>
-            </w:r>
-          </w:p>
-        </w:tc>
-      </w:tr>
-      <w:tr>
-        <w:trPr>
-          <w:cantSplit/>
-          <w:tblHeader w:val="off"/>
-        </w:trPr>
-        <w:tc>
-          <w:tcPr>
-            <w:tcW w:type="dxa" w:w="4300"/>
-            <w:tcBorders>
-              <w:top w:val="none" w:color="FFFFFF" w:sz="0"/>
-              <w:left w:val="none" w:color="FFFFFF" w:sz="0"/>
-              <w:bottom w:val="none" w:color="FFFFFF" w:sz="0"/>
-              <w:right w:val="none" w:color="FFFFFF" w:sz="0"/>
-            </w:tcBorders>
-            <w:shd w:fill="FFFFFF" w:color="auto" w:val="clear"/>
-            <w:tcMar>
-              <w:top w:type="dxa" w:w="40"/>
-              <w:left w:type="dxa" w:w="80"/>
-              <w:bottom w:type="dxa" w:w="40"/>
-              <w:right w:type="dxa" w:w="80"/>
-            </w:tcMar>
-          </w:tcPr>
-          <w:p>
-            <w:pPr>
-              <w:spacing w:after="0" w:before="0" w:line="240"/>
-              <w:jc w:val="left"/>
-            </w:pPr>
-            <w:r>
-              <w:rPr>
-                <w:rFonts w:ascii="Times New Roman" w:cs="Times New Roman" w:eastAsia="Times New Roman" w:hAnsi="Times New Roman"/>
-                <w:sz w:val="20"/>
-                <w:szCs w:val="20"/>
-              </w:rPr>
-              <w:t xml:space="preserve">Check: gain minus neutral + target</w:t>
-            </w:r>
-          </w:p>
-        </w:tc>
-        <w:tc>
-          <w:tcPr>
-            <w:tcW w:type="dxa" w:w="2530"/>
-            <w:tcBorders>
-              <w:top w:val="none" w:color="FFFFFF" w:sz="0"/>
-              <w:left w:val="none" w:color="FFFFFF" w:sz="0"/>
-              <w:bottom w:val="none" w:color="FFFFFF" w:sz="0"/>
-              <w:right w:val="none" w:color="FFFFFF" w:sz="0"/>
-            </w:tcBorders>
-            <w:shd w:fill="FFFFFF" w:color="auto" w:val="clear"/>
-            <w:tcMar>
-              <w:top w:type="dxa" w:w="40"/>
-              <w:left w:type="dxa" w:w="80"/>
-              <w:bottom w:type="dxa" w:w="40"/>
-              <w:right w:type="dxa" w:w="80"/>
-            </w:tcMar>
-          </w:tcPr>
-          <w:p>
-            <w:pPr>
-              <w:spacing w:after="0" w:before="0" w:line="240"/>
-              <w:jc w:val="center"/>
-            </w:pPr>
-            <w:r>
-              <w:rPr>
-                <w:rFonts w:ascii="Times New Roman" w:cs="Times New Roman" w:eastAsia="Times New Roman" w:hAnsi="Times New Roman"/>
-                <w:sz w:val="20"/>
-                <w:szCs w:val="20"/>
-              </w:rPr>
-              <w:t xml:space="preserve">+13.3 [-2.1, +27.5]</w:t>
-            </w:r>
-          </w:p>
-        </w:tc>
-        <w:tc>
-          <w:tcPr>
-            <w:tcW w:type="dxa" w:w="2530"/>
-            <w:tcBorders>
-              <w:top w:val="none" w:color="FFFFFF" w:sz="0"/>
-              <w:left w:val="none" w:color="FFFFFF" w:sz="0"/>
-              <w:bottom w:val="none" w:color="FFFFFF" w:sz="0"/>
-              <w:right w:val="none" w:color="FFFFFF" w:sz="0"/>
-            </w:tcBorders>
-            <w:shd w:fill="FFFFFF" w:color="auto" w:val="clear"/>
-            <w:tcMar>
-              <w:top w:type="dxa" w:w="40"/>
-              <w:left w:type="dxa" w:w="80"/>
-              <w:bottom w:type="dxa" w:w="40"/>
-              <w:right w:type="dxa" w:w="80"/>
-            </w:tcMar>
-          </w:tcPr>
-          <w:p>
-            <w:pPr>
-              <w:spacing w:after="0" w:before="0" w:line="240"/>
-              <w:jc w:val="center"/>
-            </w:pPr>
-            <w:r>
-              <w:rPr>
-                <w:rFonts w:ascii="Times New Roman" w:cs="Times New Roman" w:eastAsia="Times New Roman" w:hAnsi="Times New Roman"/>
-                <w:sz w:val="20"/>
-                <w:szCs w:val="20"/>
-              </w:rPr>
-              <w:t xml:space="preserve">+14.0 [+1.9, +28.3]</w:t>
-            </w:r>
-          </w:p>
-        </w:tc>
-      </w:tr>
-    </w:tbl>
-    <w:p>
-      <w:pPr>
-        <w:spacing w:after="240" w:before="60" w:line="240"/>
-      </w:pPr>
-      <w:r>
-        <w:rPr>
-          <w:rFonts w:ascii="Times New Roman" w:cs="Times New Roman" w:eastAsia="Times New Roman" w:hAnsi="Times New Roman"/>
           <w:i/>
           <w:iCs/>
-          <w:sz w:val="20"/>
-          <w:szCs w:val="20"/>
-        </w:rPr>
-        <w:t xml:space="preserve">Note.</w:t>
-      </w:r>
-      <w:r>
-        <w:rPr>
-          <w:rFonts w:ascii="Times New Roman" w:cs="Times New Roman" w:eastAsia="Times New Roman" w:hAnsi="Times New Roman"/>
-          <w:sz w:val="20"/>
-          <w:szCs w:val="20"/>
-        </w:rPr>
-        <w:t xml:space="preserve"> Intervals resample wordings and are not adjusted for multiplicity.</w:t>
+          <w:sz w:val="24"/>
+          <w:szCs w:val="24"/>
+        </w:rPr>
+        <w:t xml:space="preserve">11.1 Summary of findings</w:t>
       </w:r>
     </w:p>
     <w:p>
@@ -17405,24 +15018,7 @@
           <w:sz w:val="24"/>
           <w:szCs w:val="24"/>
         </w:rPr>
-        <w:t xml:space="preserve">Two cautions apply. The intervals are 95% intervals over wordings and are not adjusted for multiplicity, as in Studies 2 to 5. And one of seven models passing the screen is a modest base for generalization: the pattern is present in two small models from two vendors, with a smaller frame difference in the second (-26.2 against -62.9 points at three turns left), and it is absent or too small to estimate in the others. We therefore do not claim that it holds for small models in general.</w:t>
-      </w:r>
-    </w:p>
-    <w:p>
-      <w:pPr>
-        <w:pStyle w:val="Heading1"/>
-        <w:keepNext/>
-        <w:spacing w:after="0" w:before="0" w:line="480"/>
-      </w:pPr>
-      <w:r>
-        <w:rPr>
-          <w:rFonts w:ascii="Times New Roman" w:cs="Times New Roman" w:eastAsia="Times New Roman" w:hAnsi="Times New Roman"/>
-          <w:b/>
-          <w:bCs/>
-          <w:sz w:val="24"/>
-          <w:szCs w:val="24"/>
-        </w:rPr>
-        <w:t xml:space="preserve">11. Discussion</w:t>
+        <w:t xml:space="preserve">The registered question is whether an LLM maintenance operator chases losses because of accounting frames. We find no evidence of it in the three models of Study 1, in the four commercial tiers of Study 2, or in the fast tier with thinking or with the target manipulated in Studies 3 and 4 (P4). Where skipping occurs, it is associated with time pressure (P3) and with a visible target (P1), reasoning removes most of it (P2), stating the expected quality change of each option lowers it without removing it (P5), and larger commercial tiers that reason by default did not skip at all (P6). A small model from a second vendor (Gemini 2.5 Flash-Lite) showed the same ordering of frames, the effect of time pressure, and an effect of target visibility, while the other four valid small models skipped little or not at all (Study 6). The finding is not that framing is irrelevant: the headline sentence moved the fast tier's skipping from 0% to 100% across conditions. It is that the ingredient that mattered appears to be what the sentence tells the operator about the goal, and not whether it describes a loss.</w:t>
       </w:r>
     </w:p>
     <w:p>
@@ -17441,7 +15037,7 @@
           <w:sz w:val="24"/>
           <w:szCs w:val="24"/>
         </w:rPr>
-        <w:t xml:space="preserve">11.1 Summary of findings</w:t>
+        <w:t xml:space="preserve">11.2 Theoretical contributions</w:t>
       </w:r>
     </w:p>
     <w:p>
@@ -17456,7 +15052,67 @@
           <w:sz w:val="24"/>
           <w:szCs w:val="24"/>
         </w:rPr>
-        <w:t xml:space="preserve">The registered question is whether an LLM maintenance operator chases losses because of accounting frames. We find no evidence of it in the three models of Study 1, in the four commercial tiers of Study 2, or in the fast tier with thinking or with the target manipulated in Studies 3 and 4 (P4). Where skipping occurs, it is associated with time pressure (P3) and with a visible target (P1), reasoning removes most of it (P2), stating the expected quality change of each option lowers it without removing it (P5), and larger commercial tiers that reason by default did not skip at all (P6). A small model from a second vendor (Gemini 2.5 Flash-Lite) showed the same ordering of frames, the effect of time pressure, and an effect of target visibility, while the other four valid small models skipped little or not at all (Study 6). The finding is not that framing is irrelevant: the headline sentence moved the fast tier's skipping from 0% to 100% across conditions. It is that the ingredient that mattered appears to be what the sentence tells the operator about the goal, and not whether it describes a loss.</w:t>
+        <w:t xml:space="preserve">The contributions follow the conceptual model in Section 2.6. First, the paper moves the question from whether an LLM reproduces a human bias to which features of the delegation interface control its risk behavior; the features that mattered here, the visibility of the target, reasoning, and time pressure, are all set by the principal. Second, a registered test of a prominent behavioral claim is reported as specified, and later studies identify what is associated with the behavior instead, so that a null result comes with an account of what moves it. Third, the design in which wording is the unit of replication, with variance shares for frame, wording, and interaction, is a procedure that other studies of LLMs as subjects can use. Fourth, the floor effects in three larger models mark the boundary within which the question is informative.</w:t>
+      </w:r>
+    </w:p>
+    <w:p>
+      <w:pPr>
+        <w:spacing w:after="0" w:before="0" w:line="480"/>
+        <w:ind w:firstLine="720"/>
+        <w:jc w:val="left"/>
+      </w:pPr>
+      <w:r>
+        <w:rPr>
+          <w:rFonts w:ascii="Times New Roman" w:cs="Times New Roman" w:eastAsia="Times New Roman" w:hAnsi="Times New Roman"/>
+          <w:sz w:val="24"/>
+          <w:szCs w:val="24"/>
+        </w:rPr>
+        <w:t xml:space="preserve">We contribute to the behavioral literature on LLMs by separating two accounts that prior framing studies often leave confounded. Loss chasing predicts that loss text raises risk taking with everything else held fixed. Goal visibility predicts that stating the target raises it whatever the valence. The 2 x 2 design in Study 4 separates them, and the data are closer to the second. Goals act as reference points (Heath et al. 1999) and effort shifts as a goal draws near (Kivetz et al. 2006); our results are consistent with an operator that, given a visible gap and few turns, trades verification for speed, and they show that this does not require, and is not helped by, a description of loss. A prospect-theoretic reading remains possible if loss text refers to a past reference (the last stable level) and goal text to a future one; the data say that the second reference, not the first, moves the choice. We do not claim to identify a mechanism inside the model.</w:t>
+      </w:r>
+    </w:p>
+    <w:p>
+      <w:pPr>
+        <w:spacing w:after="0" w:before="0" w:line="480"/>
+        <w:ind w:firstLine="720"/>
+        <w:jc w:val="left"/>
+      </w:pPr>
+      <w:r>
+        <w:rPr>
+          <w:rFonts w:ascii="Times New Roman" w:cs="Times New Roman" w:eastAsia="Times New Roman" w:hAnsi="Times New Roman"/>
+          <w:sz w:val="24"/>
+          <w:szCs w:val="24"/>
+        </w:rPr>
+        <w:t xml:space="preserve">For information systems research, the results bear on how control signals work in AI delegation. Research on algorithmic control emphasizes what systems monitor and direct (Kellogg et al. 2020), and research on automation emphasizes human reliance on machines (Raisch and Krakowski 2021). Our data add a third element: the text through which a principal communicates goals to an AI agent is itself a lever on the agent's verification behavior. The pattern that a specific, visible target is associated with shortcut taking in the fast model parallels the human findings on goal setting (Schweitzer et al. 2004; Ordóñez et al. 2009), and it suggests that insights from agency and goal-setting theory may transfer to AI agents, with the caveat that a language model has no motives and that we identify no mechanism.</w:t>
+      </w:r>
+    </w:p>
+    <w:p>
+      <w:pPr>
+        <w:spacing w:after="0" w:before="0" w:line="480"/>
+        <w:ind w:firstLine="720"/>
+        <w:jc w:val="left"/>
+      </w:pPr>
+      <w:r>
+        <w:rPr>
+          <w:rFonts w:ascii="Times New Roman" w:cs="Times New Roman" w:eastAsia="Times New Roman" w:hAnsi="Times New Roman"/>
+          <w:sz w:val="24"/>
+          <w:szCs w:val="24"/>
+        </w:rPr>
+        <w:t xml:space="preserve">Our reasoning result sits beside work reporting the opposite pattern. Jiang and Tang (2026) find that stronger reasoning makes agents more likely to trade safety for utility under pressure, whereas we find less skipping with reasoning in the fast model and none in the larger tiers. The two need not conflict. Their setting makes compliance infeasible and sets a rule against a goal, whereas in ours the verified options remain feasible and the shortcut is a dominated option, so deliberation can favor the verified route. We cannot tell which feature of the settings accounts for the difference, and a design that varies both within one environment would be needed to say.</w:t>
+      </w:r>
+    </w:p>
+    <w:p>
+      <w:pPr>
+        <w:spacing w:after="0" w:before="0" w:line="480"/>
+        <w:ind w:firstLine="720"/>
+        <w:jc w:val="left"/>
+      </w:pPr>
+      <w:r>
+        <w:rPr>
+          <w:rFonts w:ascii="Times New Roman" w:cs="Times New Roman" w:eastAsia="Times New Roman" w:hAnsi="Times New Roman"/>
+          <w:sz w:val="24"/>
+          <w:szCs w:val="24"/>
+        </w:rPr>
+        <w:t xml:space="preserve">We also contribute a measurement argument. In environments where a recovery option has positive expected value after a loss, the intuitive escalation test, "does the risk index rise after failures?", is confounded by the normative benchmark: the rational operator lowers it, so the test rewards the wrong behavior in both directions. We recommend that evaluations of this kind (i) compute the expected-value-maximizing action in every state and report excess risk over it, (ii) require the inferior high-risk action, here test-skipping, to rise before calling a pattern loss chasing, (iii) check that the dominance of the inferior action is visible to the operator or learnable by it, since a verbal description of the options can turn a dominated action into a defensible time-risk trade-off when turns are scarce, (iv) estimate any frame effect over many independently generated wordings, treating the wording as the unit of replication, (v) report a floor effect explicitly as a non-test and not as a null, and (vi) vary the target statement and the valence separately, because a "gain" frame that names the goal bundles two manipulations.</w:t>
       </w:r>
     </w:p>
     <w:p>
@@ -17475,7 +15131,7 @@
           <w:sz w:val="24"/>
           <w:szCs w:val="24"/>
         </w:rPr>
-        <w:t xml:space="preserve">11.2 Theoretical contributions</w:t>
+        <w:t xml:space="preserve">11.3 Implications for information systems practice</w:t>
       </w:r>
     </w:p>
     <w:p>
@@ -17490,7 +15146,26 @@
           <w:sz w:val="24"/>
           <w:szCs w:val="24"/>
         </w:rPr>
-        <w:t xml:space="preserve">The contributions follow the conceptual model in Section 2.6. First, the paper moves the question from whether an LLM reproduces a human bias to which features of the delegation interface control its risk behavior; the features that mattered here, the visibility of the target, reasoning, and time pressure, are all set by the principal. Second, a registered test of a prominent behavioral claim is reported as specified, and later studies identify what is associated with the behavior instead, so that a null result comes with an account of what moves it. Third, the design in which wording is the unit of replication, with variance shares for frame, wording, and interaction, is a procedure that other studies of LLMs as subjects can use. Fourth, the floor effects in three larger models mark the boundary within which the question is informative.</w:t>
+        <w:t xml:space="preserve">For organizations that consider delegating maintenance decisions to an LLM, the implication is an audit, not a rule about wording. How an operator model responds to a status line depends on the model, on whether it reasons, on how close the target is, and on the sentence. Four practices follow. First, audit the candidate model on the organization's own payoff structure with many wordings of each message and with its reasoning setting fixed as it will be deployed; the same model skipped verification in 27% of cases with its default setting and in 10% with thinking enabled. Second, treat status text, including how prominently a target or a gap to it is shown, as controlled configuration: it moved the fast model's skipping by tens of points, and it should be versioned and re-tested when it changes. Third, loss-worded messages should not be assumed to be the risk; in this environment they were associated with the least skipping in the fast model, and the wording associated with the most skipping displayed a target. Fourth, for unattended operation under deadlines, a reasoning-enabled tier and a deployment gate that makes verification the default are worth considering: the cost is low and the gate removes the option that the environment defines as dominated.</w:t>
+      </w:r>
+    </w:p>
+    <w:p>
+      <w:pPr>
+        <w:pStyle w:val="Heading2"/>
+        <w:keepNext/>
+        <w:spacing w:after="0" w:before="0" w:line="480"/>
+      </w:pPr>
+      <w:r>
+        <w:rPr>
+          <w:rFonts w:ascii="Times New Roman" w:cs="Times New Roman" w:eastAsia="Times New Roman" w:hAnsi="Times New Roman"/>
+          <w:b/>
+          <w:bCs/>
+          <w:i/>
+          <w:iCs/>
+          <w:sz w:val="24"/>
+          <w:szCs w:val="24"/>
+        </w:rPr>
+        <w:t xml:space="preserve">11.4 Limitations</w:t>
       </w:r>
     </w:p>
     <w:p>
@@ -17505,120 +15180,7 @@
           <w:sz w:val="24"/>
           <w:szCs w:val="24"/>
         </w:rPr>
-        <w:t xml:space="preserve">We contribute to the behavioral literature on LLMs by separating two accounts that prior framing studies often leave confounded. Loss chasing predicts that loss text raises risk taking with everything else held fixed. Goal visibility predicts that stating the target raises it whatever the valence. The 2 x 2 design in Study 4 separates them, and the data are closer to the second. Goals act as reference points (Heath et al. 1999) and effort shifts as a goal draws near (Kivetz et al. 2006); our results are consistent with an operator that, given a visible gap and few turns, trades verification for speed, and they show that this does not require, and is not helped by, a description of loss. A prospect-theoretic reading remains possible if loss text refers to a past reference (the last stable level) and goal text to a future one; the data say that the second reference, not the first, moves the choice. We do not claim to identify a mechanism inside the model.</w:t>
-      </w:r>
-    </w:p>
-    <w:p>
-      <w:pPr>
-        <w:spacing w:after="0" w:before="0" w:line="480"/>
-        <w:ind w:firstLine="720"/>
-        <w:jc w:val="left"/>
-      </w:pPr>
-      <w:r>
-        <w:rPr>
-          <w:rFonts w:ascii="Times New Roman" w:cs="Times New Roman" w:eastAsia="Times New Roman" w:hAnsi="Times New Roman"/>
-          <w:sz w:val="24"/>
-          <w:szCs w:val="24"/>
-        </w:rPr>
-        <w:t xml:space="preserve">For information systems research, the results bear on how control signals work in AI delegation. Research on algorithmic control emphasizes what systems monitor and direct (Kellogg et al. 2020), and research on automation emphasizes human reliance on machines (Raisch and Krakowski 2021). Our data add a third element: the text through which a principal communicates goals to an AI agent is itself a lever on the agent's verification behavior. The pattern that a specific, visible target is associated with shortcut taking in the fast model parallels the human findings on goal setting (Schweitzer et al. 2004; Ordóñez et al. 2009), and it suggests that insights from agency and goal-setting theory may transfer to AI agents, with the caveat that a language model has no motives and that we identify no mechanism.</w:t>
-      </w:r>
-    </w:p>
-    <w:p>
-      <w:pPr>
-        <w:spacing w:after="0" w:before="0" w:line="480"/>
-        <w:ind w:firstLine="720"/>
-        <w:jc w:val="left"/>
-      </w:pPr>
-      <w:r>
-        <w:rPr>
-          <w:rFonts w:ascii="Times New Roman" w:cs="Times New Roman" w:eastAsia="Times New Roman" w:hAnsi="Times New Roman"/>
-          <w:sz w:val="24"/>
-          <w:szCs w:val="24"/>
-        </w:rPr>
-        <w:t xml:space="preserve">Our reasoning result sits beside work reporting the opposite pattern. Jiang and Tang (2026) find that stronger reasoning makes agents more likely to trade safety for utility under pressure, whereas we find less skipping with reasoning in the fast model and none in the larger tiers. The two need not conflict. Their setting makes compliance infeasible and sets a rule against a goal, whereas in ours the verified options remain feasible and the shortcut is a dominated option, so deliberation can favor the verified route. We cannot tell which feature of the settings accounts for the difference, and a design that varies both within one environment would be needed to say.</w:t>
-      </w:r>
-    </w:p>
-    <w:p>
-      <w:pPr>
-        <w:spacing w:after="0" w:before="0" w:line="480"/>
-        <w:ind w:firstLine="720"/>
-        <w:jc w:val="left"/>
-      </w:pPr>
-      <w:r>
-        <w:rPr>
-          <w:rFonts w:ascii="Times New Roman" w:cs="Times New Roman" w:eastAsia="Times New Roman" w:hAnsi="Times New Roman"/>
-          <w:sz w:val="24"/>
-          <w:szCs w:val="24"/>
-        </w:rPr>
-        <w:t xml:space="preserve">We also contribute a measurement argument. In environments where a recovery option has positive expected value after a loss, the intuitive escalation test, "does the risk index rise after failures?", is confounded by the normative benchmark: the rational operator lowers it, so the test rewards the wrong behavior in both directions. We recommend that evaluations of this kind (i) compute the expected-value-maximizing action in every state and report excess risk over it, (ii) require the inferior high-risk action, here test-skipping, to rise before calling a pattern loss chasing, (iii) check that the dominance of the inferior action is visible to the operator or learnable by it, since a verbal description of the options can turn a dominated action into a defensible time-risk trade-off when turns are scarce, (iv) estimate any frame effect over many independently generated wordings, treating the wording as the unit of replication, (v) report a floor effect explicitly as a non-test and not as a null, and (vi) vary the target statement and the valence separately, because a "gain" frame that names the goal bundles two manipulations.</w:t>
-      </w:r>
-    </w:p>
-    <w:p>
-      <w:pPr>
-        <w:pStyle w:val="Heading2"/>
-        <w:keepNext/>
-        <w:spacing w:after="0" w:before="0" w:line="480"/>
-      </w:pPr>
-      <w:r>
-        <w:rPr>
-          <w:rFonts w:ascii="Times New Roman" w:cs="Times New Roman" w:eastAsia="Times New Roman" w:hAnsi="Times New Roman"/>
-          <w:b/>
-          <w:bCs/>
-          <w:i/>
-          <w:iCs/>
-          <w:sz w:val="24"/>
-          <w:szCs w:val="24"/>
-        </w:rPr>
-        <w:t xml:space="preserve">11.3 Implications for information systems practice</w:t>
-      </w:r>
-    </w:p>
-    <w:p>
-      <w:pPr>
-        <w:spacing w:after="0" w:before="0" w:line="480"/>
-        <w:ind w:firstLine="720"/>
-        <w:jc w:val="left"/>
-      </w:pPr>
-      <w:r>
-        <w:rPr>
-          <w:rFonts w:ascii="Times New Roman" w:cs="Times New Roman" w:eastAsia="Times New Roman" w:hAnsi="Times New Roman"/>
-          <w:sz w:val="24"/>
-          <w:szCs w:val="24"/>
-        </w:rPr>
-        <w:t xml:space="preserve">For organizations that consider delegating maintenance decisions to an LLM, the implication is an audit, not a rule about wording. How an operator model responds to a status line depends on the model, on whether it reasons, on how close the target is, and on the sentence. Four practices follow. First, audit the candidate model on the organization's own payoff structure with many wordings of each message and with its reasoning setting fixed as it will be deployed; the same model skipped verification in 27% of cases with its default setting and in 10% with thinking enabled. Second, treat status text, including how prominently a target or a gap to it is shown, as controlled configuration: it moved the fast model's skipping by tens of points, and it should be versioned and re-tested when it changes. Third, loss-worded messages should not be assumed to be the risk; in this environment they were associated with the least skipping in the fast model, and the wording associated with the most skipping displayed a target. Fourth, for unattended operation under deadlines, a reasoning-enabled tier and a deployment gate that makes verification the default are worth considering: the cost is low and the gate removes the option that the environment defines as dominated.</w:t>
-      </w:r>
-    </w:p>
-    <w:p>
-      <w:pPr>
-        <w:pStyle w:val="Heading2"/>
-        <w:keepNext/>
-        <w:spacing w:after="0" w:before="0" w:line="480"/>
-      </w:pPr>
-      <w:r>
-        <w:rPr>
-          <w:rFonts w:ascii="Times New Roman" w:cs="Times New Roman" w:eastAsia="Times New Roman" w:hAnsi="Times New Roman"/>
-          <w:b/>
-          <w:bCs/>
-          <w:i/>
-          <w:iCs/>
-          <w:sz w:val="24"/>
-          <w:szCs w:val="24"/>
-        </w:rPr>
-        <w:t xml:space="preserve">11.4 Limitations</w:t>
-      </w:r>
-    </w:p>
-    <w:p>
-      <w:pPr>
-        <w:spacing w:after="0" w:before="0" w:line="480"/>
-        <w:ind w:firstLine="720"/>
-        <w:jc w:val="left"/>
-      </w:pPr>
-      <w:r>
-        <w:rPr>
-          <w:rFonts w:ascii="Times New Roman" w:cs="Times New Roman" w:eastAsia="Times New Roman" w:hAnsi="Times New Roman"/>
-          <w:sz w:val="24"/>
-          <w:szCs w:val="24"/>
-        </w:rPr>
-        <w:t xml:space="preserve">First, the commercial ladder confounds tier with reasoning and sampling control. Sonnet 5.5, Opus 5.5, and Fable 5.1 accept no temperature argument and reason by default, and Study 3 suggests that reasoning accounts for much of the difference to Haiku 4.5; the remainder cannot be assigned to size, to training, or to the amount of reasoning, and we do not claim a size effect. Second, the main results come from two small models that skip, from two vendors, in one condition (no injected failures) at three turns left; Study 1 covers failure history only at twelve turns left. Third, Studies 2 to 5 were designed after Study 1 and were not registered. Their analysis scripts were written before the runs and their contrasts are descriptive, but the questions they answer were shaped by earlier output, the four studies together make many comparisons, and the intervals are not adjusted for multiplicity, although the three-turn contrasts of Study 2 and the main contrasts of Study 4 (the goal effect with neutral text, valence without a target statement, and the registered contrast) stay clear of zero at the 99.6% level, while the interaction and several finer contrasts in Study 4 do not. Fourth, the 16 wordings per frame were generated by a language model and filtered by mechanical rules, with two of three batches served by a fallback model; they cover a wider range than four hand-written paraphrases but are not a random sample of all possible wordings, and loss wordings contain stronger affect verbs ("knocked," "took a hit," "eroded") than the gain and neutral wordings, which could contribute to the lower skipping under loss text; the split of loss wordings by verb in Study 2 does not support this, but it is a comparison of six and ten wordings with a wide interval. Fifth, the format pre-fill for the open models is an intervention outside the registered protocol, and the open models were run at temperature 0.7 only. We also started the 16-wording design on the small open models and stopped it: it ran on a local processor, was interrupted repeatedly, and had reached 966 of 1,440 first choices for one model and none for the other. We stopped for reasons of time and did not analyze the partial output, so the decision did not depend on results; the open models therefore appear only in Study 1 and in the Study 2 pilot. Sixth, a scalar quality score compresses multidimensional incidents into one line, and the six closed actions simplify the continuous space of field work. Seventh, a model does not feel loss; it reacts to text statistics, and the design does not identify the mechanism by which a sentence changes a choice. Reasons the models give are post hoc statements and are not used as evidence. Eighth, in Studies 1 to 4 the operator sees only qualitative option descriptions, so the dominance of verification is visible to the designer but not to the operator, and part of the skipping may be a defensible trade-off from the operator's information. Study 5 shows that skipping persists at 17% to 25% in the target-stating frames when the expected quality change is stated, but it also lowers it substantially, and the added text may act as a cue; the baseline and expected-value runs share a design but not their sampling draws. Ninth, results for commercial models depend on the model version at the time of the run. External validity is left to follow-up work applying the same coding scheme to live tickets.</w:t>
+        <w:t xml:space="preserve">First, the commercial ladder confounds tier with reasoning and sampling control: Sonnet 5.5, Opus 5.5, and Fable 5.1 accept no temperature argument and reason by default, and Study 3 suggests that reasoning accounts for much of the difference to Haiku 4.5; we do not claim a size effect. Second, the main results come from two small models that skip, from two vendors, in one condition (no injected failures) at three turns left; Study 1 covers failure history only at twelve turns left. Third, Studies 2 to 6 were designed after Study 1 and were not registered. Their analysis scripts were written before the runs and their contrasts are descriptive, but the questions they answer were shaped by earlier output, the studies together make many comparisons, and the intervals are not adjusted for multiplicity, although the three-turn contrasts of Study 2 and the main contrasts of Study 4 stay clear of zero at the 99.6% level while the interaction and several finer contrasts do not. Fourth, the 16 wordings per frame were generated by a language model and filtered by mechanical rules, with two of three batches served by a fallback model; they are not a random sample of all possible wordings, and loss wordings contain stronger affect verbs than the gain and neutral wordings, which could contribute to the lower skipping under loss text, although a split of loss wordings by verb in Study 2 does not support this (a comparison of six and ten wordings with a wide interval). Fifth, the format pre-fill for the open models is an intervention outside the registered protocol, and the open models were run at temperature 0.7 only. We also started the 16-wording design on the two open models and stopped it for reasons of time, with 966 of 1,440 first choices for one model and none for the other, without analyzing the partial output; the open models therefore appear only in Study 1 and in the Study 2 pilot. In Study 6, two of seven small models produced invalid runs and are excluded, and only one model passed the screen. Sixth, a scalar quality score compresses multidimensional incidents into one line, and the six closed actions simplify the continuous space of field work. Seventh, a model does not feel loss; it reacts to text statistics, the design does not identify the mechanism by which a sentence changes a choice, and the reasons the models give are post hoc and are not used as evidence. Eighth, in Studies 1 to 4 the operator sees only qualitative option descriptions, so part of the skipping may be a defensible trade-off from its information; Study 5 shows that skipping persists at 17% to 25% in the target-stating frames when the expected quality change is stated, but also lowers it substantially, and the added text may act as a cue. Ninth, results depend on the model version at the time of the run, and external validity is left to follow-up work applying the same coding scheme to live tickets.</w:t>
       </w:r>
     </w:p>
     <w:p>

</xml_diff>

<commit_message>
Tighten introduction, Study 1 section 5.3 and Study 2 text to gain page margin
Co-Authored-By: Claude Sonnet 5.5 <noreply@anthropic.com>
Claude-Session: https://claude.ai/code/session_013HycsBHnRQDCEHKmLM3Rd4
</commit_message>
<xml_diff>
--- a/loss_chasing/isr/ISR_manuscript_v4.docx
+++ b/loss_chasing/isr/ISR_manuscript_v4.docx
@@ -145,7 +145,7 @@
           <w:sz w:val="24"/>
           <w:szCs w:val="24"/>
         </w:rPr>
-        <w:t xml:space="preserve">The quality of a deployed large language model (LLM) is not fixed at launch. Knowledge goes stale, the distribution on which a reward model was trained drifts away from live traffic, guardrails and prompts accumulate edits, and offline evaluation sets diverge from what users actually ask. Practitioners call the resulting erosion model aging. Maintenance is therefore not a one-time alignment step but a repeated decision made under uncertainty, and in practice that decision collapses to a small closed set of options: hold, apply a narrow patch, apply a wide patch, apply either without running the regression tests, or roll back. Each option trades the expected gain in quality against the risk of a further incident and against the turns, and hence the time, that verification consumes.</w:t>
+        <w:t xml:space="preserve">The quality of a deployed large language model (LLM) is not fixed at launch. Knowledge goes stale, live traffic drifts away from the data on which reward models were trained, prompts and guardrails accumulate edits, and offline evaluation sets diverge from what users ask. Maintenance is therefore a repeated decision under uncertainty that collapses to a small set of options: hold, apply a narrow or wide patch, apply either without running the regression tests, or roll back. Each option trades expected quality gain against the risk of a further incident and against the turns, and hence the time, that verification consumes.</w:t>
       </w:r>
     </w:p>
     <w:p>
@@ -160,7 +160,7 @@
           <w:sz w:val="24"/>
           <w:szCs w:val="24"/>
         </w:rPr>
-        <w:t xml:space="preserve">It is increasingly proposed that some of these decisions be delegated to LLM-based agents that operate the maintenance pipeline themselves. Whether such an operator behaves like the disciplined engineer a runbook presupposes is an empirical question with direct consequences for information systems governance. A substantial behavioral literature suggests reasons for doubt. Prospect theory holds that people are risk seeking below a reference point and risk averse above it (Kahneman and Tversky 1979), and that the same outcome coded as a gain or as a loss changes the choice made (Tversky and Kahneman 1981). In gambling this appears as loss chasing: a decision maker who has suffered a loss places further bets, even of negative expected value, to get back to the break-even point (Thaler and Johnson 1990). If an LLM operator inherits such tendencies from its training data, the wording of a dashboard line such as "the last update cost us two points" could make it more willing to skip verification precisely when verification matters most.</w:t>
+        <w:t xml:space="preserve">Some of these decisions are increasingly proposed for delegation to LLM-based agents that operate the maintenance pipeline themselves. Whether such an operator behaves like the disciplined engineer a runbook presupposes is an empirical question with consequences for information systems governance. Behavioral research gives reasons for doubt. Prospect theory holds that people are risk seeking below a reference point and risk averse above it (Kahneman and Tversky 1979) and that the same outcome coded as a gain or a loss changes the choice (Tversky and Kahneman 1981); in gambling this appears as loss chasing, in which a decision maker places further bets, even of negative expected value, to get back to break-even (Thaler and Johnson 1990). If an LLM operator inherits such tendencies, a dashboard line such as "the last update cost us two points" could make it more willing to skip verification when verification matters most.</w:t>
       </w:r>
     </w:p>
     <w:p>
@@ -175,7 +175,7 @@
           <w:sz w:val="24"/>
           <w:szCs w:val="24"/>
         </w:rPr>
-        <w:t xml:space="preserve">Prior work asks whether LLMs show human-like biases in classic economic tasks (Horton 2023; Ross et al. 2024; Bini et al. 2026) and whether gambling-like risk taking appears in their generated output (Du 2025). It rarely asks the operational question: in a repeated loop, immediately after a failed update, does the model choose a larger change and omit verification, and is that choice moved by the accounting frame alone? Answering it requires an environment in which the normatively correct choice is known, so that a departure can be attributed to loss accounting rather than to a reasonable adaptation to time pressure, and it requires a design that does not mistake a property of one sentence for a property of a frame.</w:t>
+        <w:t xml:space="preserve">Prior work asks whether LLMs show human-like biases in classic economic tasks (Horton 2023; Ross et al. 2024; Bini et al. 2026) and whether gambling-like risk taking appears in generated output (Du 2025). It rarely asks the operational question: in a repeated loop, after a failed update, does the model choose a larger change and omit verification, and is that choice moved by the accounting frame alone? Answering it requires an environment in which the correct choice is known, so that a departure can be attributed to loss accounting and not to a reasonable response to time pressure, and a design that does not mistake a property of one sentence for a property of a frame.</w:t>
       </w:r>
     </w:p>
     <w:p>
@@ -190,7 +190,7 @@
           <w:sz w:val="24"/>
           <w:szCs w:val="24"/>
         </w:rPr>
-        <w:t xml:space="preserve">The question also has an information systems reading. Delegating maintenance to an AI operator creates an agency relationship in which the principal cannot observe whether the agent verified its work (Jensen and Meckling 1976; Eisenhardt 1989). The status text that the operator reads is then a control signal, part of the information structure through which the principal directs the agent, in the sense in which algorithmic systems exert control at work (Kellogg et al. 2020). Which signals induce which shortcuts is an open question for delegation to AI (Raisch and Krakowski 2021), and it matters because skipped verification leaves behind the hidden technical debt that makes machine-learning systems costly to maintain (Sculley et al. 2015).</w:t>
+        <w:t xml:space="preserve">The question also has an information systems reading. Delegating maintenance to an AI operator creates an agency relationship in which the principal cannot observe whether the agent verified its work (Jensen and Meckling 1976; Eisenhardt 1989), and the status text the operator reads is a control signal through which the principal directs it (Kellogg et al. 2020). Which signals induce which shortcuts is open for delegation to AI (Raisch and Krakowski 2021), and it matters because skipped verification leaves hidden technical debt (Sculley et al. 2015).</w:t>
       </w:r>
     </w:p>
     <w:p>
@@ -205,7 +205,7 @@
           <w:sz w:val="24"/>
           <w:szCs w:val="24"/>
         </w:rPr>
-        <w:t xml:space="preserve">We therefore place an LLM in the role of an on-call lead and manipulate the headline sentence that describes the situation (loss, gain-to-goal, or neutral, all carrying identical facts), the number of injected failures, and, in later studies, the turns remaining, the model, its reasoning setting, and whether the target is stated. Quality, the remaining turn budget, and the options are otherwise held fixed. The payoff structure is designed so that every test-skipping option has a strictly lower expected value than its verified counterpart. Everything is scored by rule, and no human participants are recruited.</w:t>
+        <w:t xml:space="preserve">We place an LLM in the role of an on-call lead and manipulate the headline sentence (loss, gain-to-goal, or neutral, all carrying identical facts), the failures injected into the history and, in later studies, the turns left, the model, its reasoning setting, and whether the target is stated. Every test-skipping option has a strictly lower expected value than its verified counterpart, everything is scored by rule, and no human participants are recruited. The registered hypothesis is one candidate explanation among several, so we treat the paper as a study of which features of the delegation interface govern skipping: the valence of the status text, the visibility of the target, the turns left, reasoning, the information shown about the options, and the model tier (Section 2.6).</w:t>
       </w:r>
     </w:p>
     <w:p>
@@ -220,7 +220,7 @@
           <w:sz w:val="24"/>
           <w:szCs w:val="24"/>
         </w:rPr>
-        <w:t xml:space="preserve">The registered hypothesis is one candidate explanation among several for why an operator might skip verification. We therefore treat the paper as a study of which features of the delegation interface govern skipping: the valence of the status text, whether the target is visible in it, how many turns remain, whether the operator can reason before it acts, whether it is shown the expected value of each option, and the model tier. Section 2.6 states these as propositions.</w:t>
+        <w:t xml:space="preserve">The paper reports six studies in sequence. Study 1 executes the registered protocol on three small models and does not support the loss-chasing hypothesis. It left three questions open: whether the frame effect survives when each frame is written in many independent wordings, what determines skipping in the one model that skips, and whether models that did not skip differ in kind or are held back by something that can be varied. Studies 2 to 4 address them, Study 5 asks whether skipping persists when the dominance of verification is made visible, and Study 6, governed by a screening rule fixed before the runs, asks whether small models from other vendors show the same pattern. Studies 2 to 6 were designed after Study 1 and are not part of the registered protocol; we say so where each is reported and do not adjust any interval for that fact.</w:t>
       </w:r>
     </w:p>
     <w:p>
@@ -235,22 +235,7 @@
           <w:sz w:val="24"/>
           <w:szCs w:val="24"/>
         </w:rPr>
-        <w:t xml:space="preserve">The paper reports six studies run in sequence. Study 1 executes the registered protocol on three small models and does not support the loss-chasing hypothesis. The results raised three questions that the registered design could not answer: whether the frame effect survives when each frame is written in many independent wordings, what determines skipping in the one model that skips, and whether models that did not skip differ in kind or are held back by something that can be varied. Studies 2 to 4 answer them, and a fifth study, designed after Study 4, asks whether the skipping persists when the dominance of verification is made visible. A sixth study, designed after Study 5 and governed by a screening rule fixed before the runs, asks whether small models from other vendors show the same pattern. They were designed after Study 1 and are not part of the registered protocol; we state this in the sections that report them and do not adjust any interval for that fact.</w:t>
-      </w:r>
-    </w:p>
-    <w:p>
-      <w:pPr>
-        <w:spacing w:after="0" w:before="0" w:line="480"/>
-        <w:ind w:firstLine="720"/>
-        <w:jc w:val="left"/>
-      </w:pPr>
-      <w:r>
-        <w:rPr>
-          <w:rFonts w:ascii="Times New Roman" w:cs="Times New Roman" w:eastAsia="Times New Roman" w:hAnsi="Times New Roman"/>
-          <w:sz w:val="24"/>
-          <w:szCs w:val="24"/>
-        </w:rPr>
-        <w:t xml:space="preserve">We make four contributions. First, we move the question from whether LLMs copy human biases to which features of the delegation interface control an operator's risk behavior. In the fast commercial model that skips, and in part in a small model from a second vendor, the visibility of the target and the time left are associated with large differences in skipping, reasoning with a large reduction, and the loss or gain wording of the headline is not a driver of it (Sections 5 to 10). Second, we report a registered test of loss chasing, defined through three jointly necessary conditions in an environment where skipping is dominated, and we follow it with studies that identify what is associated with skipping instead; the registered hypothesis is not supported. Third, we provide a design for evaluating LLM operators in which the wording is the unit of replication, with 16 independently generated wordings per frame so that the frame, wording, and interaction effects can be separated, and a measurement argument: when a rollback of positive expected value exists, the natural test that risk rises after failures mislabels rational retreat, and we propose excess risk over an expected-value benchmark together with test-skipping. Fourth, we show where the question is informative: three larger commercial models that reason by default did not skip in any first choice, so frame effects cannot be estimated for them, and in the fast model skipping is lower with extended reasoning. We also provide an open, human-subject-free audit that an organization can run on a candidate operator before delegating maintenance decisions to it.</w:t>
+        <w:t xml:space="preserve">We make four contributions. First, we move the question from whether LLMs copy human biases to which features of the delegation interface control an operator's risk behavior: in the fast commercial model that skips, and in part in a small model from a second vendor, the visibility of the target and the time left are associated with large differences in skipping and reasoning with a large reduction, whereas the loss or gain wording of the headline is not a driver of it. Second, we report a registered test of loss chasing, defined through three jointly necessary conditions in an environment where skipping is dominated, and then identify what is associated with skipping instead; the registered hypothesis is not supported. Third, we provide a design in which wording is the unit of replication, with 16 independently generated wordings per frame so that frame, wording, and interaction effects can be separated, and a measurement argument: when a rollback of positive expected value exists, the natural test that risk rises after failures mislabels rational retreat, so we propose excess risk over an expected-value benchmark together with test-skipping. Fourth, we show where the question is informative: three larger commercial models that reason by default did not skip, so frame effects cannot be estimated for them. We also provide a human-subject-free audit that an organization can run on a candidate operator before delegating maintenance decisions to it.</w:t>
       </w:r>
     </w:p>
     <w:p>
@@ -6732,7 +6717,7 @@
           <w:sz w:val="24"/>
           <w:szCs w:val="24"/>
         </w:rPr>
-        <w:t xml:space="preserve"> injected failures), so the expected-value-maximizing policy lowers its risk index, from 0.60 with no history to 0.20 after three failures. The registered H2 test therefore classifies the rational benchmark as a non-instance, and any operator that simply fails to retreat looks "riskier" than it is. Table 4 reports the registered rule and a criterion that requires excess risk to rise by at least 0.10 (Welch </w:t>
+        <w:t xml:space="preserve"> injected failures), so the expected-value-maximizing policy lowers its risk index, from 0.60 with no history to 0.20 after three failures. The registered H2 test therefore classifies the rational benchmark as a non-instance, and an operator that simply fails to retreat looks riskier than it is. Table 4 reports the registered rule and a criterion, specified after Study 1 output, that requires excess risk to rise by at least 0.10 (Welch </w:t>
       </w:r>
       <w:r>
         <w:rPr>
@@ -6750,7 +6735,7 @@
           <w:sz w:val="24"/>
           <w:szCs w:val="24"/>
         </w:rPr>
-        <w:t xml:space="preserve"> &lt; .05) and skipping to rise; the criterion was specified after Study 1 output.</w:t>
+        <w:t xml:space="preserve"> &lt; .05) and skipping to rise.</w:t>
       </w:r>
     </w:p>
     <w:p>
@@ -7632,7 +7617,7 @@
           <w:sz w:val="24"/>
           <w:szCs w:val="24"/>
         </w:rPr>
-        <w:t xml:space="preserve"> = .003): it under-responds to failure, it does not chase. SmolLM2 skips more after failures (2.7% to 11.7%; coefficient +1.58, Holm </w:t>
+        <w:t xml:space="preserve"> = .003): it under-responds to failure and does not chase. SmolLM2 skips more after failures (2.7% to 11.7%; coefficient +1.58, Holm </w:t>
       </w:r>
       <w:r>
         <w:rPr>
@@ -7650,7 +7635,7 @@
           <w:sz w:val="24"/>
           <w:szCs w:val="24"/>
         </w:rPr>
-        <w:t xml:space="preserve"> &lt; .001) in all three frames, so this is a failure-history effect independent of framing; after three failures its excess risk is about zero, so it is not riskier than a rational agent at that point. Claude behaves like the benchmark: its expected-value gap is 0.000 in the loss frame and -0.003 in the neutral frame, and after failures it retreats as the benchmark does. An early version of the automatic analysis flagged Claude's H2 as supported solely because all three-failure values were identical, so that their variance was zero; that was an artifact, not an effect.</w:t>
+        <w:t xml:space="preserve"> &lt; .001) in all three frames, a failure-history effect independent of framing; its excess risk after three failures is about zero, so it is not riskier than a rational agent. Claude behaves like the benchmark and retreats after failures. An early version of the automatic analysis flagged Claude's H2 as supported only because all three-failure values were identical, so that their variance was zero; that was an artifact.</w:t>
       </w:r>
     </w:p>
     <w:p>
@@ -9686,7 +9671,7 @@
           <w:sz w:val="24"/>
           <w:szCs w:val="24"/>
         </w:rPr>
-        <w:t xml:space="preserve">Haiku 4.5 did not skip with twelve turns left, almost never with six (0.5%), and skipped in 27.2% of first choices with three left, with cell rates from 0% to 100%. At three turns left the loss frame was below the gain-to-goal frame in 15 of 16 wordings and above it in none, by 62.9 percentage points on average, and the neutral frame was below it by 50.4 points. Frame explained 52.4% of the variation in the wording-by-frame table, wording 9.7%, and the interaction 37.9%, against a noise floor of only 1.3%. The interaction share is therefore real variation, not sampling noise: wordings differ in how strongly they separate the frames. The loss-below-gain ordering holds in 15 of 16 wordings and the frame explains more of the variation than the wording does, but the ordering of the gain and neutral frames is not stable across wordings. Cell rates varied widely. Loss-frame cells never exceeded 16.7% under any wording, gain-frame cells ranged from 6.7% to 100%, and neutral-frame cells from 0% to 83.3%. Under the registered wording the neutral frame skipped in 83.3% of first choices and the gain frame in 6.7%, the reverse of the average ordering. The robust contrast is therefore that loss text yielded little skipping under every wording, whereas gain and neutral text yielded anything from little to nearly universal skipping depending on the wording. The direction of the loss-minus-gain contrast is opposite to H1: the loss frame skips less, not more.</w:t>
+        <w:t xml:space="preserve">Haiku 4.5 did not skip with twelve turns left, almost never with six (0.5%), and skipped in 27.2% of first choices with three left, with cell rates from 0% to 100%. At three turns left the loss frame was below the gain-to-goal frame in 15 of 16 wordings and above it in none, by 62.9 percentage points on average, and the neutral frame was below it by 50.4 points. Frame explained 52.4% of the variation in the wording-by-frame table, wording 9.7%, and the interaction 37.9%, against a noise floor of 1.3%, so the interaction share is real: wordings differ in how strongly they separate the frames. The ordering of the gain and neutral frames is not stable across wordings. Loss-frame cells never exceeded 16.7%, gain-frame cells ranged from 6.7% to 100%, and neutral-frame cells from 0% to 83.3%; under the registered wording the neutral frame skipped in 83.3% of first choices and the gain frame in 6.7%, the reverse of the average ordering. The robust contrast is that loss text yielded little skipping under every wording, whereas gain and neutral text yielded anything from little to nearly universal skipping depending on the wording. The direction of loss minus gain is opposite to H1.</w:t>
       </w:r>
     </w:p>
     <w:p>
@@ -9746,7 +9731,7 @@
           <w:sz w:val="24"/>
           <w:szCs w:val="24"/>
         </w:rPr>
-        <w:t xml:space="preserve">The two open models of Study 1 were not rerun with the 16 wordings. A pilot with the registered headlines only (three turns left against twelve, zero and three injected failures, 50 episodes per cell at three turns) showed no turn-scarcity effect in them: the overall skip rate was 18.0% at twelve turns and 18.3% at three for Qwen, and 7.2% versus 7.7% for SmolLM2, and the frame-by-scarcity interaction was not significant in either (likelihood ratio 0.25 and 1.95, </w:t>
+        <w:t xml:space="preserve">The two open models of Study 1 were not rerun with the 16 wordings. A pilot with the registered headlines only (three turns left against twelve, zero and three injected failures, 50 episodes per cell at three turns) showed no turn-scarcity effect in them (overall skip rate 18.0% at twelve turns and 18.3% at three for Qwen, 7.2% versus 7.7% for SmolLM2; frame-by-scarcity interaction not significant, </w:t>
       </w:r>
       <w:r>
         <w:rPr>
@@ -9764,7 +9749,7 @@
           <w:sz w:val="24"/>
           <w:szCs w:val="24"/>
         </w:rPr>
-        <w:t xml:space="preserve"> = .88 and .38). Their frame differences kept their signs. The turn-scarcity effect therefore appears specific to the commercial model that skips, although the pilot is small.</w:t>
+        <w:t xml:space="preserve"> = .88 and .38), and their frame differences kept their signs. The turn-scarcity effect therefore appears specific to the commercial model that skips, although the pilot is small.</w:t>
       </w:r>
     </w:p>
     <w:p>

</xml_diff>